<commit_message>
Tutorial 4 PWM slides (three methods, polling/interrupt/hardware timing); A2 Part A shortened; A3 drafted; session table and deck sections updated; MP.md notes
Co-Authored-By: Claude Opus 5.5 <noreply@anthropic.com>
</commit_message>
<xml_diff>
--- a/MP2026_plan.docx
+++ b/MP2026_plan.docx
@@ -29,7 +29,7 @@
         <w:pStyle w:val="Date"/>
       </w:pPr>
       <w:r>
-        <w:t xml:space="preserve">Draft of 2026-10-15</w:t>
+        <w:t xml:space="preserve">Draft of 2026-10-19</w:t>
       </w:r>
     </w:p>
     <w:bookmarkStart w:id="9" w:name="sessions"/>
@@ -387,7 +387,7 @@
               <w:jc w:val="left"/>
             </w:pPr>
             <w:r>
-              <w:t xml:space="preserve">A1 out</w:t>
+              <w:t xml:space="preserve">A1 out: variables and wrap, bit operations, trigerring, timing, IR sensor logics</w:t>
             </w:r>
           </w:p>
         </w:tc>
@@ -598,7 +598,15 @@
           <w:p>
             <w:pPr>
               <w:pStyle w:val="Compact"/>
-            </w:pPr>
+              <w:jc w:val="left"/>
+            </w:pPr>
+            <w:r>
+              <w:rPr>
+                <w:b/>
+                <w:bCs/>
+              </w:rPr>
+              <w:t xml:space="preserve">Last material included in A1</w:t>
+            </w:r>
           </w:p>
         </w:tc>
       </w:tr>
@@ -662,19 +670,62 @@
               <w:t xml:space="preserve"> </w:t>
             </w:r>
             <w:r>
-              <w:t xml:space="preserve">non-blocking timing.</w:t>
-            </w:r>
-          </w:p>
-        </w:tc>
-        <w:tc>
-          <w:tcPr/>
-          <w:p>
-            <w:pPr>
-              <w:pStyle w:val="Compact"/>
-              <w:jc w:val="left"/>
-            </w:pPr>
-            <w:r>
-              <w:t xml:space="preserve">Multi-rate blink from a timer interrupt (no</w:t>
+              <w:t xml:space="preserve">non-blocking timing. Interrupts in depth: the interrupt service routine (ISR), the NVIC and the</w:t>
+            </w:r>
+            <w:r>
+              <w:t xml:space="preserve"> </w:t>
+            </w:r>
+            <w:r>
+              <w:t xml:space="preserve">vector table, the HAL chain (</w:t>
+            </w:r>
+            <w:r>
+              <w:rPr>
+                <w:rStyle w:val="VerbatimChar"/>
+              </w:rPr>
+              <w:t xml:space="preserve">IRQHandler</w:t>
+            </w:r>
+            <w:r>
+              <w:t xml:space="preserve"> </w:t>
+            </w:r>
+            <m:oMath>
+              <m:r>
+                <m:rPr>
+                  <m:sty m:val="p"/>
+                </m:rPr>
+                <m:t>→</m:t>
+              </m:r>
+            </m:oMath>
+            <w:r>
+              <w:t xml:space="preserve"> </w:t>
+            </w:r>
+            <w:r>
+              <w:rPr>
+                <w:rStyle w:val="VerbatimChar"/>
+              </w:rPr>
+              <w:t xml:space="preserve">HAL_TIM_IRQHandler</w:t>
+            </w:r>
+            <w:r>
+              <w:t xml:space="preserve"> </w:t>
+            </w:r>
+            <m:oMath>
+              <m:r>
+                <m:rPr>
+                  <m:sty m:val="p"/>
+                </m:rPr>
+                <m:t>→</m:t>
+              </m:r>
+            </m:oMath>
+            <w:r>
+              <w:t xml:space="preserve"> </w:t>
+            </w:r>
+            <w:r>
+              <w:t xml:space="preserve">callback), the cost of</w:t>
+            </w:r>
+            <w:r>
+              <w:t xml:space="preserve"> </w:t>
+            </w:r>
+            <w:r>
+              <w:t xml:space="preserve">entering and leaving an interrupt, keeping ISRs short (no blocking calls, no</w:t>
             </w:r>
             <w:r>
               <w:t xml:space="preserve"> </w:t>
@@ -686,31 +737,43 @@
               <w:t xml:space="preserve">HAL_Delay</w:t>
             </w:r>
             <w:r>
-              <w:t xml:space="preserve">); state-machine skeleton (</w:t>
+              <w:t xml:space="preserve">), variables shared</w:t>
+            </w:r>
+            <w:r>
+              <w:t xml:space="preserve"> </w:t>
+            </w:r>
+            <w:r>
+              <w:t xml:space="preserve">with the main loop.</w:t>
+            </w:r>
+          </w:p>
+        </w:tc>
+        <w:tc>
+          <w:tcPr/>
+          <w:p>
+            <w:pPr>
+              <w:pStyle w:val="Compact"/>
+              <w:jc w:val="left"/>
+            </w:pPr>
+            <w:r>
+              <w:t xml:space="preserve">PWM, three methods: polling (</w:t>
             </w:r>
             <w:r>
               <w:rPr>
                 <w:rStyle w:val="VerbatimChar"/>
               </w:rPr>
-              <w:t xml:space="preserve">enum</w:t>
+              <w:t xml:space="preserve">HAL_GetTick</w:t>
             </w:r>
             <w:r>
               <w:t xml:space="preserve"> </w:t>
             </w:r>
             <w:r>
-              <w:t xml:space="preserve">+</w:t>
+              <w:t xml:space="preserve">in the main loop), interrupt (TIM7 callback) and hardware</w:t>
             </w:r>
             <w:r>
               <w:t xml:space="preserve"> </w:t>
             </w:r>
             <w:r>
-              <w:rPr>
-                <w:rStyle w:val="VerbatimChar"/>
-              </w:rPr>
-              <w:t xml:space="preserve">switch</w:t>
-            </w:r>
-            <w:r>
-              <w:t xml:space="preserve">).</w:t>
+              <w:t xml:space="preserve">(timer CCR); what each must fit in time; the ISR and the HAL callback chain.</w:t>
             </w:r>
           </w:p>
         </w:tc>
@@ -938,20 +1001,28 @@
               <w:jc w:val="left"/>
             </w:pPr>
             <w:r>
-              <w:t xml:space="preserve">SR04 single distance measurement; EXTI interrupt with a counter; PWM on one motor channel.</w:t>
-            </w:r>
-          </w:p>
-        </w:tc>
-        <w:tc>
-          <w:tcPr/>
-          <w:p>
-            <w:pPr>
-              <w:pStyle w:val="Compact"/>
-              <w:jc w:val="left"/>
-            </w:pPr>
-            <w:r>
-              <w:t xml:space="preserve">A2 out</w:t>
-            </w:r>
+              <w:t xml:space="preserve">Blocking vs. non-blocking: writing a register inside the STM32 (one store, nanoseconds) vs. a register on</w:t>
+            </w:r>
+            <w:r>
+              <w:t xml:space="preserve"> </w:t>
+            </w:r>
+            <w:r>
+              <w:t xml:space="preserve">another chip over I2C (about 0.3 ms); updating the 24 LED registers one per loop pass; the decide, store and</w:t>
+            </w:r>
+            <w:r>
+              <w:t xml:space="preserve"> </w:t>
+            </w:r>
+            <w:r>
+              <w:t xml:space="preserve">transport layers and the super loop. SR04 single distance measurement; EXTI interrupt with a counter.</w:t>
+            </w:r>
+          </w:p>
+        </w:tc>
+        <w:tc>
+          <w:tcPr/>
+          <w:p>
+            <w:pPr>
+              <w:pStyle w:val="Compact"/>
+            </w:pPr>
           </w:p>
         </w:tc>
       </w:tr>
@@ -1006,16 +1077,20 @@
               <w:jc w:val="left"/>
             </w:pPr>
             <w:r>
-              <w:t xml:space="preserve">One wheel in the air: open-loop PWM, encoder to rad/s, record and export to MATLAB.</w:t>
-            </w:r>
-          </w:p>
-        </w:tc>
-        <w:tc>
-          <w:tcPr/>
-          <w:p>
-            <w:pPr>
-              <w:pStyle w:val="Compact"/>
-            </w:pPr>
+              <w:t xml:space="preserve">One wheel in the air: open-loop PWM, encoder to rad/s, record and export to MATLAB. Fit a model.</w:t>
+            </w:r>
+          </w:p>
+        </w:tc>
+        <w:tc>
+          <w:tcPr/>
+          <w:p>
+            <w:pPr>
+              <w:pStyle w:val="Compact"/>
+              <w:jc w:val="left"/>
+            </w:pPr>
+            <w:r>
+              <w:t xml:space="preserve">A2 out: PWM, polling and interups (sensors), I2C, encoders, step response to Matlab</w:t>
+            </w:r>
           </w:p>
         </w:tc>
       </w:tr>
@@ -1087,6 +1162,87 @@
               <w:jc w:val="left"/>
             </w:pPr>
             <w:r>
+              <w:t xml:space="preserve">Different encoder configurations.</w:t>
+            </w:r>
+          </w:p>
+        </w:tc>
+        <w:tc>
+          <w:tcPr/>
+          <w:p>
+            <w:pPr>
+              <w:pStyle w:val="Compact"/>
+              <w:jc w:val="left"/>
+            </w:pPr>
+            <w:r>
+              <w:rPr>
+                <w:b/>
+                <w:bCs/>
+              </w:rPr>
+              <w:t xml:space="preserve">Last material included in A2</w:t>
+            </w:r>
+          </w:p>
+        </w:tc>
+      </w:tr>
+      <w:tr>
+        <w:tc>
+          <w:tcPr/>
+          <w:p>
+            <w:pPr>
+              <w:pStyle w:val="Compact"/>
+              <w:jc w:val="center"/>
+            </w:pPr>
+            <w:r>
+              <w:t xml:space="preserve">9</w:t>
+            </w:r>
+          </w:p>
+        </w:tc>
+        <w:tc>
+          <w:tcPr/>
+          <w:p>
+            <w:pPr>
+              <w:pStyle w:val="Compact"/>
+              <w:jc w:val="left"/>
+            </w:pPr>
+            <w:r>
+              <w:t xml:space="preserve">28.12.2026</w:t>
+            </w:r>
+          </w:p>
+        </w:tc>
+        <w:tc>
+          <w:tcPr/>
+          <w:p>
+            <w:pPr>
+              <w:pStyle w:val="Compact"/>
+              <w:jc w:val="left"/>
+            </w:pPr>
+            <w:r>
+              <w:t xml:space="preserve">UART command protocol: interrupt-driven receive, command interpreter, ASCII vs. binary framing; MATLAB</w:t>
+            </w:r>
+            <w:r>
+              <w:t xml:space="preserve"> </w:t>
+            </w:r>
+            <w:r>
+              <w:rPr>
+                <w:rStyle w:val="VerbatimChar"/>
+              </w:rPr>
+              <w:t xml:space="preserve">serialport</w:t>
+            </w:r>
+            <w:r>
+              <w:t xml:space="preserve"> </w:t>
+            </w:r>
+            <w:r>
+              <w:t xml:space="preserve">and an App Designer GUI.</w:t>
+            </w:r>
+          </w:p>
+        </w:tc>
+        <w:tc>
+          <w:tcPr/>
+          <w:p>
+            <w:pPr>
+              <w:pStyle w:val="Compact"/>
+              <w:jc w:val="left"/>
+            </w:pPr>
+            <w:r>
               <w:t xml:space="preserve">Control workflow: fit,</w:t>
             </w:r>
             <w:r>
@@ -1130,83 +1286,6 @@
             </w:pPr>
             <w:r>
               <w:t xml:space="preserve">Quiz 2 (first hour)</w:t>
-            </w:r>
-          </w:p>
-        </w:tc>
-      </w:tr>
-      <w:tr>
-        <w:tc>
-          <w:tcPr/>
-          <w:p>
-            <w:pPr>
-              <w:pStyle w:val="Compact"/>
-              <w:jc w:val="center"/>
-            </w:pPr>
-            <w:r>
-              <w:t xml:space="preserve">9</w:t>
-            </w:r>
-          </w:p>
-        </w:tc>
-        <w:tc>
-          <w:tcPr/>
-          <w:p>
-            <w:pPr>
-              <w:pStyle w:val="Compact"/>
-              <w:jc w:val="left"/>
-            </w:pPr>
-            <w:r>
-              <w:t xml:space="preserve">28.12.2026</w:t>
-            </w:r>
-          </w:p>
-        </w:tc>
-        <w:tc>
-          <w:tcPr/>
-          <w:p>
-            <w:pPr>
-              <w:pStyle w:val="Compact"/>
-              <w:jc w:val="left"/>
-            </w:pPr>
-            <w:r>
-              <w:t xml:space="preserve">UART command protocol: interrupt-driven receive, command interpreter, ASCII vs. binary framing; MATLAB</w:t>
-            </w:r>
-            <w:r>
-              <w:t xml:space="preserve"> </w:t>
-            </w:r>
-            <w:r>
-              <w:rPr>
-                <w:rStyle w:val="VerbatimChar"/>
-              </w:rPr>
-              <w:t xml:space="preserve">serialport</w:t>
-            </w:r>
-            <w:r>
-              <w:t xml:space="preserve"> </w:t>
-            </w:r>
-            <w:r>
-              <w:t xml:space="preserve">and an App Designer GUI.</w:t>
-            </w:r>
-          </w:p>
-        </w:tc>
-        <w:tc>
-          <w:tcPr/>
-          <w:p>
-            <w:pPr>
-              <w:pStyle w:val="Compact"/>
-              <w:jc w:val="left"/>
-            </w:pPr>
-            <w:r>
-              <w:t xml:space="preserve">UART command parser; minimal MATLAB GUI that sends commands and plots telemetry.</w:t>
-            </w:r>
-          </w:p>
-        </w:tc>
-        <w:tc>
-          <w:tcPr/>
-          <w:p>
-            <w:pPr>
-              <w:pStyle w:val="Compact"/>
-              <w:jc w:val="left"/>
-            </w:pPr>
-            <w:r>
-              <w:t xml:space="preserve">A2 due</w:t>
             </w:r>
           </w:p>
         </w:tc>
@@ -1324,16 +1403,50 @@
               <w:jc w:val="left"/>
             </w:pPr>
             <w:r>
-              <w:t xml:space="preserve">Kinematics exercises; driving the cart on the floor; a trajectory array generated in MATLAB and sent to the cart.</w:t>
-            </w:r>
-          </w:p>
-        </w:tc>
-        <w:tc>
-          <w:tcPr/>
-          <w:p>
-            <w:pPr>
-              <w:pStyle w:val="Compact"/>
-            </w:pPr>
+              <w:t xml:space="preserve">Kinematics (straight lines) and state machine: wheel speeds for driving in straight lines; a state machine</w:t>
+            </w:r>
+            <w:r>
+              <w:t xml:space="preserve"> </w:t>
+            </w:r>
+            <w:r>
+              <w:t xml:space="preserve">(</w:t>
+            </w:r>
+            <w:r>
+              <w:rPr>
+                <w:rStyle w:val="VerbatimChar"/>
+              </w:rPr>
+              <w:t xml:space="preserve">enum</w:t>
+            </w:r>
+            <w:r>
+              <w:t xml:space="preserve"> </w:t>
+            </w:r>
+            <w:r>
+              <w:t xml:space="preserve">+</w:t>
+            </w:r>
+            <w:r>
+              <w:t xml:space="preserve"> </w:t>
+            </w:r>
+            <w:r>
+              <w:rPr>
+                <w:rStyle w:val="VerbatimChar"/>
+              </w:rPr>
+              <w:t xml:space="preserve">switch</w:t>
+            </w:r>
+            <w:r>
+              <w:t xml:space="preserve">) for a driving sequence.</w:t>
+            </w:r>
+          </w:p>
+        </w:tc>
+        <w:tc>
+          <w:tcPr/>
+          <w:p>
+            <w:pPr>
+              <w:pStyle w:val="Compact"/>
+              <w:jc w:val="left"/>
+            </w:pPr>
+            <w:r>
+              <w:t xml:space="preserve">A2 due</w:t>
+            </w:r>
           </w:p>
         </w:tc>
       </w:tr>
@@ -1400,7 +1513,7 @@
               <w:jc w:val="left"/>
             </w:pPr>
             <w:r>
-              <w:t xml:space="preserve">A3 out</w:t>
+              <w:t xml:space="preserve">A3 out: Controller design, obstacle avoiding, state machine</w:t>
             </w:r>
           </w:p>
         </w:tc>
@@ -1522,6 +1635,30 @@
         </w:tc>
       </w:tr>
     </w:tbl>
+    <w:p>
+      <w:pPr>
+        <w:pStyle w:val="BodyText"/>
+      </w:pPr>
+      <w:r>
+        <w:rPr>
+          <w:b/>
+          <w:bCs/>
+        </w:rPr>
+        <w:t xml:space="preserve">Last material included in A1/A2:</w:t>
+      </w:r>
+      <w:r>
+        <w:t xml:space="preserve"> </w:t>
+      </w:r>
+      <w:r>
+        <w:t xml:space="preserve">an assignment may require material taught up to and including</w:t>
+      </w:r>
+      <w:r>
+        <w:t xml:space="preserve"> </w:t>
+      </w:r>
+      <w:r>
+        <w:t xml:space="preserve">that lecture (one week after the assignment is out), and nothing taught later.</w:t>
+      </w:r>
+    </w:p>
     <w:bookmarkEnd w:id="9"/>
     <w:bookmarkStart w:id="10" w:name="grading"/>
     <w:p>
@@ -1661,7 +1798,13 @@
               <w:jc w:val="left"/>
             </w:pPr>
             <w:r>
-              <w:t xml:space="preserve">Sessions 4 to 7: timers and interrupts, state machines, I2C, PWM and input capture, motors and encoders</w:t>
+              <w:t xml:space="preserve">Sessions 4 to 8: timers and interrupts, state machines, I2C, PWM and input capture, motors and encoders,</w:t>
+            </w:r>
+            <w:r>
+              <w:t xml:space="preserve"> </w:t>
+            </w:r>
+            <w:r>
+              <w:t xml:space="preserve">PI speed control</w:t>
             </w:r>
           </w:p>
         </w:tc>
@@ -1737,7 +1880,13 @@
               <w:jc w:val="left"/>
             </w:pPr>
             <w:r>
-              <w:t xml:space="preserve">DC motors and PWM, encoders, timer interrupts, PI speed control, UART (wheels in the air)</w:t>
+              <w:t xml:space="preserve">Software and hardware PWM, interrupts (EXTI, input capture), I2C drivers, encoders and speed,</w:t>
+            </w:r>
+            <w:r>
+              <w:t xml:space="preserve"> </w:t>
+            </w:r>
+            <w:r>
+              <w:t xml:space="preserve">step response (wheels in the air)</w:t>
             </w:r>
           </w:p>
         </w:tc>
@@ -1775,7 +1924,13 @@
               <w:jc w:val="left"/>
             </w:pPr>
             <w:r>
-              <w:t xml:space="preserve">Driving on the ground, ultrasonic sensing, MATLAB GUI, Simulink to C</w:t>
+              <w:t xml:space="preserve">PI speed control from the fitted model, driving in straight lines, obstacle avoidance with the IR and</w:t>
+            </w:r>
+            <w:r>
+              <w:t xml:space="preserve"> </w:t>
+            </w:r>
+            <w:r>
+              <w:t xml:space="preserve">ultrasonic sensors, a state machine; bonus: return to the start</w:t>
             </w:r>
           </w:p>
         </w:tc>
@@ -1794,7 +1949,7 @@
       </w:tr>
     </w:tbl>
     <w:bookmarkEnd w:id="10"/>
-    <w:bookmarkStart w:id="36" w:name="assignments"/>
+    <w:bookmarkStart w:id="44" w:name="assignments"/>
     <w:p>
       <w:pPr>
         <w:pStyle w:val="Heading1"/>
@@ -2373,6 +2528,51 @@
       </w:r>
       <w:r>
         <w:t xml:space="preserve">.</w:t>
+      </w:r>
+      <w:r>
+        <w:t xml:space="preserve"> </w:t>
+      </w:r>
+      <w:r>
+        <w:rPr>
+          <w:rStyle w:val="Colorred"/>
+        </w:rPr>
+        <w:t xml:space="preserve">[For Bucher and Yohai, delete before publishing: if the</w:t>
+      </w:r>
+      <w:r>
+        <w:rPr>
+          <w:rStyle w:val="Colorred"/>
+        </w:rPr>
+        <w:t xml:space="preserve"> </w:t>
+      </w:r>
+      <w:r>
+        <w:rPr>
+          <w:rStyle w:val="VerbatimChar"/>
+        </w:rPr>
+        <w:t xml:space="preserve">printf</w:t>
+      </w:r>
+      <w:r>
+        <w:rPr>
+          <w:rStyle w:val="Colorred"/>
+        </w:rPr>
+        <w:t xml:space="preserve"> </w:t>
+      </w:r>
+      <w:r>
+        <w:rPr>
+          <w:rStyle w:val="Colorred"/>
+        </w:rPr>
+        <w:t xml:space="preserve">redirect to PuTTY is taught in</w:t>
+      </w:r>
+      <w:r>
+        <w:rPr>
+          <w:rStyle w:val="Colorred"/>
+        </w:rPr>
+        <w:t xml:space="preserve"> </w:t>
+      </w:r>
+      <w:r>
+        <w:rPr>
+          <w:rStyle w:val="Colorred"/>
+        </w:rPr>
+        <w:t xml:space="preserve">lecture 3, perhaps this appendix can be deleted.]</w:t>
       </w:r>
     </w:p>
     <w:p>
@@ -3288,7 +3488,7 @@
         <w:rPr>
           <w:rStyle w:val="Colorred"/>
         </w:rPr>
-        <w:t xml:space="preserve">[For Bucher and Yohai, delete before publishing: (b) shows bouncing only if the IO-board buttons</w:t>
+        <w:t xml:space="preserve">[For Bucher and Yohai, delete before publishing: another bounce check will be done with the I2C bus</w:t>
       </w:r>
       <w:r>
         <w:rPr>
@@ -3300,19 +3500,7 @@
         <w:rPr>
           <w:rStyle w:val="Colorred"/>
         </w:rPr>
-        <w:t xml:space="preserve">bounce and no hardware filter hides it. Verify on the cart with state 17 of the hardware test before</w:t>
-      </w:r>
-      <w:r>
-        <w:rPr>
-          <w:rStyle w:val="Colorred"/>
-        </w:rPr>
-        <w:t xml:space="preserve"> </w:t>
-      </w:r>
-      <w:r>
-        <w:rPr>
-          <w:rStyle w:val="Colorred"/>
-        </w:rPr>
-        <w:t xml:space="preserve">publishing; if the I2C buttons show no bounce, use the Nucleo button B1 with an EXTI interrupt instead.]</w:t>
+        <w:t xml:space="preserve">at 400 kHz instead of the current 100 kHz.]</w:t>
       </w:r>
     </w:p>
     <w:bookmarkEnd w:id="14"/>
@@ -5209,7 +5397,7 @@
     <w:bookmarkEnd w:id="24"/>
     <w:bookmarkEnd w:id="25"/>
     <w:bookmarkEnd w:id="26"/>
-    <w:bookmarkStart w:id="33" w:name="assignment-2-wheels-in-the-air"/>
+    <w:bookmarkStart w:id="38" w:name="assignment-2-wheels-in-the-air"/>
     <w:p>
       <w:pPr>
         <w:pStyle w:val="Heading2"/>
@@ -5229,16 +5417,116 @@
         <w:pStyle w:val="FirstParagraph"/>
       </w:pPr>
       <w:r>
-        <w:t xml:space="preserve">To be defined.</w:t>
-      </w:r>
-    </w:p>
-    <w:bookmarkStart w:id="32" w:name="assignment-2-project-configuration-.ioc"/>
-    <w:p>
-      <w:pPr>
-        <w:pStyle w:val="Heading3"/>
-      </w:pPr>
-      <w:r>
-        <w:t xml:space="preserve">Assignment 2: project configuration (</w:t>
+        <w:rPr>
+          <w:b/>
+          <w:bCs/>
+        </w:rPr>
+        <w:t xml:space="preserve">Window:</w:t>
+      </w:r>
+      <w:r>
+        <w:t xml:space="preserve"> </w:t>
+      </w:r>
+      <w:r>
+        <w:t xml:space="preserve">out at session 7, due at session 10. The assignment may use everything taught up to and including</w:t>
+      </w:r>
+      <w:r>
+        <w:t xml:space="preserve"> </w:t>
+      </w:r>
+      <w:r>
+        <w:t xml:space="preserve">session 8.</w:t>
+      </w:r>
+      <w:r>
+        <w:t xml:space="preserve"> </w:t>
+      </w:r>
+      <w:r>
+        <w:rPr>
+          <w:b/>
+          <w:bCs/>
+        </w:rPr>
+        <w:t xml:space="preserve">Hardware:</w:t>
+      </w:r>
+      <w:r>
+        <w:t xml:space="preserve"> </w:t>
+      </w:r>
+      <w:r>
+        <w:t xml:space="preserve">the cart</w:t>
+      </w:r>
+      <w:r>
+        <w:t xml:space="preserve"> </w:t>
+      </w:r>
+      <w:r>
+        <w:rPr>
+          <w:b/>
+          <w:bCs/>
+        </w:rPr>
+        <w:t xml:space="preserve">on its block, wheels in the air</w:t>
+      </w:r>
+      <w:r>
+        <w:t xml:space="preserve">, battery and motor power on, the IO board, the IR</w:t>
+      </w:r>
+      <w:r>
+        <w:t xml:space="preserve"> </w:t>
+      </w:r>
+      <w:r>
+        <w:t xml:space="preserve">sensor and the ultrasonic sensor.</w:t>
+      </w:r>
+      <w:r>
+        <w:t xml:space="preserve"> </w:t>
+      </w:r>
+      <w:r>
+        <w:rPr>
+          <w:b/>
+          <w:bCs/>
+        </w:rPr>
+        <w:t xml:space="preserve">Project:</w:t>
+      </w:r>
+      <w:r>
+        <w:t xml:space="preserve"> </w:t>
+      </w:r>
+      <w:r>
+        <w:rPr>
+          <w:rStyle w:val="VerbatimChar"/>
+        </w:rPr>
+        <w:t xml:space="preserve">ass2.ioc</w:t>
+      </w:r>
+      <w:r>
+        <w:t xml:space="preserve">, which you build yourself from</w:t>
+      </w:r>
+      <w:r>
+        <w:t xml:space="preserve"> </w:t>
+      </w:r>
+      <w:r>
+        <w:rPr>
+          <w:rStyle w:val="VerbatimChar"/>
+        </w:rPr>
+        <w:t xml:space="preserve">ass1.ioc</w:t>
+      </w:r>
+      <w:r>
+        <w:t xml:space="preserve"> </w:t>
+      </w:r>
+      <w:r>
+        <w:t xml:space="preserve">as described in</w:t>
+      </w:r>
+      <w:r>
+        <w:t xml:space="preserve"> </w:t>
+      </w:r>
+      <w:r>
+        <w:t xml:space="preserve">“Assignment 2:</w:t>
+      </w:r>
+      <w:r>
+        <w:t xml:space="preserve"> </w:t>
+      </w:r>
+      <w:r>
+        <w:t xml:space="preserve">project configuration”</w:t>
+      </w:r>
+      <w:r>
+        <w:t xml:space="preserve"> </w:t>
+      </w:r>
+      <w:r>
+        <w:t xml:space="preserve">below (no</w:t>
+      </w:r>
+      <w:r>
+        <w:t xml:space="preserve"> </w:t>
       </w:r>
       <w:r>
         <w:rPr>
@@ -5247,7 +5535,142 @@
         <w:t xml:space="preserve">.ioc</w:t>
       </w:r>
       <w:r>
-        <w:t xml:space="preserve">)</w:t>
+        <w:t xml:space="preserve"> </w:t>
+      </w:r>
+      <w:r>
+        <w:t xml:space="preserve">is provided for this assignment).</w:t>
+      </w:r>
+    </w:p>
+    <w:p>
+      <w:pPr>
+        <w:pStyle w:val="BodyText"/>
+      </w:pPr>
+      <w:r>
+        <w:rPr>
+          <w:b/>
+          <w:bCs/>
+        </w:rPr>
+        <w:t xml:space="preserve">Provided files.</w:t>
+      </w:r>
+      <w:r>
+        <w:t xml:space="preserve"> </w:t>
+      </w:r>
+      <w:r>
+        <w:rPr>
+          <w:rStyle w:val="VerbatimChar"/>
+        </w:rPr>
+        <w:t xml:space="preserve">io_board.h</w:t>
+      </w:r>
+      <w:r>
+        <w:t xml:space="preserve"> </w:t>
+      </w:r>
+      <w:r>
+        <w:t xml:space="preserve">and</w:t>
+      </w:r>
+      <w:r>
+        <w:t xml:space="preserve"> </w:t>
+      </w:r>
+      <w:r>
+        <w:rPr>
+          <w:rStyle w:val="VerbatimChar"/>
+        </w:rPr>
+        <w:t xml:space="preserve">io_board.c</w:t>
+      </w:r>
+      <w:r>
+        <w:t xml:space="preserve"> </w:t>
+      </w:r>
+      <w:r>
+        <w:t xml:space="preserve">from Assignment 1 may still be used in Parts A,</w:t>
+      </w:r>
+      <w:r>
+        <w:t xml:space="preserve"> </w:t>
+      </w:r>
+      <w:r>
+        <w:t xml:space="preserve">B, D and E. Part C replaces them with your own driver. The</w:t>
+      </w:r>
+      <w:r>
+        <w:t xml:space="preserve"> </w:t>
+      </w:r>
+      <w:r>
+        <w:rPr>
+          <w:rStyle w:val="VerbatimChar"/>
+        </w:rPr>
+        <w:t xml:space="preserve">printf</w:t>
+      </w:r>
+      <w:r>
+        <w:t xml:space="preserve"> </w:t>
+      </w:r>
+      <w:r>
+        <w:t xml:space="preserve">redirect of Appendix A1 is needed again.</w:t>
+      </w:r>
+    </w:p>
+    <w:p>
+      <w:pPr>
+        <w:pStyle w:val="BodyText"/>
+      </w:pPr>
+      <w:r>
+        <w:rPr>
+          <w:b/>
+          <w:bCs/>
+        </w:rPr>
+        <w:t xml:space="preserve">Learning outcome.</w:t>
+      </w:r>
+      <w:r>
+        <w:t xml:space="preserve"> </w:t>
+      </w:r>
+      <w:r>
+        <w:t xml:space="preserve">Students drive outputs with software and with hardware PWM and can explain the difference;</w:t>
+      </w:r>
+      <w:r>
+        <w:t xml:space="preserve"> </w:t>
+      </w:r>
+      <w:r>
+        <w:t xml:space="preserve">they react to sensors by polling and by interrupts and can measure the advantage of interrupts; they write their own</w:t>
+      </w:r>
+      <w:r>
+        <w:t xml:space="preserve"> </w:t>
+      </w:r>
+      <w:r>
+        <w:t xml:space="preserve">I2C driver from a datasheet; they configure an encoder timer, compute wheel speed in a way that survives counter</w:t>
+      </w:r>
+      <w:r>
+        <w:t xml:space="preserve"> </w:t>
+      </w:r>
+      <w:r>
+        <w:t xml:space="preserve">wrap-around, and record a step response at a fixed rate for analysis in MATLAB.</w:t>
+      </w:r>
+    </w:p>
+    <w:p>
+      <w:pPr>
+        <w:pStyle w:val="BodyText"/>
+      </w:pPr>
+      <w:r>
+        <w:rPr>
+          <w:b/>
+          <w:bCs/>
+        </w:rPr>
+        <w:t xml:space="preserve">Safety.</w:t>
+      </w:r>
+      <w:r>
+        <w:t xml:space="preserve"> </w:t>
+      </w:r>
+      <w:r>
+        <w:t xml:space="preserve">The wheels must not touch anything while they turn. Keep fingers and cables away from the wheels, and</w:t>
+      </w:r>
+      <w:r>
+        <w:t xml:space="preserve"> </w:t>
+      </w:r>
+      <w:r>
+        <w:t xml:space="preserve">set every PWM duty to 0 at start-up.</w:t>
+      </w:r>
+    </w:p>
+    <w:bookmarkStart w:id="27" w:name="part-a-three-ways-to-make-a-pwm."/>
+    <w:p>
+      <w:pPr>
+        <w:pStyle w:val="Heading4"/>
+      </w:pPr>
+      <w:r>
+        <w:t xml:space="preserve">Part A: Three ways to make a PWM.</w:t>
       </w:r>
     </w:p>
     <w:p>
@@ -5255,28 +5678,166 @@
         <w:pStyle w:val="FirstParagraph"/>
       </w:pPr>
       <w:r>
-        <w:t xml:space="preserve">The complete Assignment 1 configuration, plus the wheels (motors and encoders), the ultrasonic sensor and the servo</w:t>
-      </w:r>
-      <w:r>
-        <w:t xml:space="preserve"> </w:t>
-      </w:r>
-      <w:r>
-        <w:t xml:space="preserve">that turns it. Do not start from scratch: duplicate</w:t>
-      </w:r>
-      <w:r>
-        <w:t xml:space="preserve"> </w:t>
-      </w:r>
-      <w:r>
-        <w:rPr>
-          <w:rStyle w:val="VerbatimChar"/>
-        </w:rPr>
-        <w:t xml:space="preserve">ass1.ioc</w:t>
-      </w:r>
-      <w:r>
-        <w:t xml:space="preserve"> </w:t>
-      </w:r>
-      <w:r>
-        <w:t xml:space="preserve">and add only the new items below.</w:t>
+        <w:t xml:space="preserve">Build the same PWM with the three methods of tutorial 4 (polling, interrupt, hardware), with its symbols</w:t>
+      </w:r>
+      <w:r>
+        <w:t xml:space="preserve"> </w:t>
+      </w:r>
+      <m:oMath>
+        <m:r>
+          <m:t>N</m:t>
+        </m:r>
+      </m:oMath>
+      <w:r>
+        <w:t xml:space="preserve">,</w:t>
+      </w:r>
+      <w:r>
+        <w:t xml:space="preserve"> </w:t>
+      </w:r>
+      <m:oMath>
+        <m:r>
+          <m:t>M</m:t>
+        </m:r>
+      </m:oMath>
+      <w:r>
+        <w:t xml:space="preserve">,</w:t>
+      </w:r>
+      <w:r>
+        <w:t xml:space="preserve"> </w:t>
+      </w:r>
+      <m:oMath>
+        <m:sSub>
+          <m:e>
+            <m:r>
+              <m:t>t</m:t>
+            </m:r>
+          </m:e>
+          <m:sub>
+            <m:r>
+              <m:rPr>
+                <m:sty m:val="p"/>
+              </m:rPr>
+              <m:t>s</m:t>
+            </m:r>
+            <m:r>
+              <m:rPr>
+                <m:sty m:val="p"/>
+              </m:rPr>
+              <m:t>t</m:t>
+            </m:r>
+            <m:r>
+              <m:rPr>
+                <m:sty m:val="p"/>
+              </m:rPr>
+              <m:t>e</m:t>
+            </m:r>
+            <m:r>
+              <m:rPr>
+                <m:sty m:val="p"/>
+              </m:rPr>
+              <m:t>p</m:t>
+            </m:r>
+          </m:sub>
+        </m:sSub>
+      </m:oMath>
+      <w:r>
+        <w:t xml:space="preserve"> </w:t>
+      </w:r>
+      <w:r>
+        <w:t xml:space="preserve">and</w:t>
+      </w:r>
+      <w:r>
+        <w:t xml:space="preserve"> </w:t>
+      </w:r>
+      <m:oMath>
+        <m:sSub>
+          <m:e>
+            <m:r>
+              <m:t>f</m:t>
+            </m:r>
+          </m:e>
+          <m:sub>
+            <m:r>
+              <m:rPr>
+                <m:sty m:val="p"/>
+              </m:rPr>
+              <m:t>P</m:t>
+            </m:r>
+            <m:r>
+              <m:rPr>
+                <m:sty m:val="p"/>
+              </m:rPr>
+              <m:t>W</m:t>
+            </m:r>
+            <m:r>
+              <m:rPr>
+                <m:sty m:val="p"/>
+              </m:rPr>
+              <m:t>M</m:t>
+            </m:r>
+          </m:sub>
+        </m:sSub>
+      </m:oMath>
+      <w:r>
+        <w:t xml:space="preserve">, and find the limits of each.</w:t>
+      </w:r>
+      <w:r>
+        <w:t xml:space="preserve"> </w:t>
+      </w:r>
+      <m:oMath>
+        <m:r>
+          <m:t>N</m:t>
+        </m:r>
+      </m:oMath>
+      <w:r>
+        <w:t xml:space="preserve"> </w:t>
+      </w:r>
+      <w:r>
+        <w:t xml:space="preserve">and</w:t>
+      </w:r>
+      <w:r>
+        <w:t xml:space="preserve"> </w:t>
+      </w:r>
+      <m:oMath>
+        <m:r>
+          <m:t>M</m:t>
+        </m:r>
+      </m:oMath>
+      <w:r>
+        <w:t xml:space="preserve"> </w:t>
+      </w:r>
+      <w:r>
+        <w:t xml:space="preserve">are global variables that you change</w:t>
+      </w:r>
+      <w:r>
+        <w:t xml:space="preserve"> </w:t>
+      </w:r>
+      <w:r>
+        <w:t xml:space="preserve">from Live Expressions while the program runs.</w:t>
+      </w:r>
+    </w:p>
+    <w:p>
+      <w:pPr>
+        <w:pStyle w:val="BodyText"/>
+      </w:pPr>
+      <w:r>
+        <w:rPr>
+          <w:b/>
+          <w:bCs/>
+        </w:rPr>
+        <w:t xml:space="preserve">Hint:</w:t>
+      </w:r>
+      <w:r>
+        <w:t xml:space="preserve"> </w:t>
+      </w:r>
+      <w:r>
+        <w:t xml:space="preserve">keep two human limits in mind. The eye stops seeing a light flicker above roughly 50 to 100 Hz, and the</w:t>
+      </w:r>
+      <w:r>
+        <w:t xml:space="preserve"> </w:t>
+      </w:r>
+      <w:r>
+        <w:t xml:space="preserve">ear hears from about 20 Hz to 20 kHz. They decide which PWM frequency is good enough for an LED and for a motor.</w:t>
       </w:r>
     </w:p>
     <w:p>
@@ -5287,22 +5848,69 @@
         </w:numPr>
       </w:pPr>
       <w:r>
-        <w:t xml:space="preserve">Open</w:t>
-      </w:r>
-      <w:r>
-        <w:t xml:space="preserve"> </w:t>
-      </w:r>
-      <w:r>
-        <w:rPr>
-          <w:rStyle w:val="VerbatimChar"/>
-        </w:rPr>
-        <w:t xml:space="preserve">ass1.ioc</w:t>
-      </w:r>
-      <w:r>
-        <w:t xml:space="preserve"> </w:t>
-      </w:r>
-      <w:r>
-        <w:t xml:space="preserve">in STM32CubeMX and save a copy with</w:t>
+        <w:t xml:space="preserve">Method 1, polling, on LD2, with</w:t>
+      </w:r>
+      <w:r>
+        <w:t xml:space="preserve"> </w:t>
+      </w:r>
+      <w:r>
+        <w:rPr>
+          <w:rStyle w:val="VerbatimChar"/>
+        </w:rPr>
+        <w:t xml:space="preserve">HAL_GetTick</w:t>
+      </w:r>
+      <w:r>
+        <w:t xml:space="preserve"> </w:t>
+      </w:r>
+      <w:r>
+        <w:t xml:space="preserve">as the step counter (</w:t>
+      </w:r>
+      <m:oMath>
+        <m:sSub>
+          <m:e>
+            <m:r>
+              <m:t>t</m:t>
+            </m:r>
+          </m:e>
+          <m:sub>
+            <m:r>
+              <m:rPr>
+                <m:sty m:val="p"/>
+              </m:rPr>
+              <m:t>s</m:t>
+            </m:r>
+            <m:r>
+              <m:rPr>
+                <m:sty m:val="p"/>
+              </m:rPr>
+              <m:t>t</m:t>
+            </m:r>
+            <m:r>
+              <m:rPr>
+                <m:sty m:val="p"/>
+              </m:rPr>
+              <m:t>e</m:t>
+            </m:r>
+            <m:r>
+              <m:rPr>
+                <m:sty m:val="p"/>
+              </m:rPr>
+              <m:t>p</m:t>
+            </m:r>
+          </m:sub>
+        </m:sSub>
+        <m:r>
+          <m:rPr>
+            <m:sty m:val="p"/>
+          </m:rPr>
+          <m:t>=</m:t>
+        </m:r>
+        <m:r>
+          <m:t>1</m:t>
+        </m:r>
+      </m:oMath>
+      <w:r>
+        <w:t xml:space="preserve"> ms).</w:t>
       </w:r>
       <w:r>
         <w:t xml:space="preserve"> </w:t>
@@ -5312,13 +5920,1589 @@
           <w:i/>
           <w:iCs/>
         </w:rPr>
-        <w:t xml:space="preserve">File</w:t>
+        <w:t xml:space="preserve">This task demonstrates a method that is not good enough, and why.</w:t>
+      </w:r>
+    </w:p>
+    <w:p>
+      <w:pPr>
+        <w:numPr>
+          <w:ilvl w:val="1"/>
+          <w:numId w:val="1012"/>
+        </w:numPr>
+      </w:pPr>
+      <w:r>
+        <w:t xml:space="preserve">With</w:t>
+      </w:r>
+      <w:r>
+        <w:t xml:space="preserve"> </w:t>
+      </w:r>
+      <m:oMath>
+        <m:r>
+          <m:t>N</m:t>
+        </m:r>
+        <m:r>
+          <m:rPr>
+            <m:sty m:val="p"/>
+          </m:rPr>
+          <m:t>=</m:t>
+        </m:r>
+        <m:r>
+          <m:t>100</m:t>
+        </m:r>
+      </m:oMath>
+      <w:r>
+        <w:t xml:space="preserve">, sweep</w:t>
+      </w:r>
+      <w:r>
+        <w:t xml:space="preserve"> </w:t>
+      </w:r>
+      <m:oMath>
+        <m:r>
+          <m:t>M</m:t>
+        </m:r>
+      </m:oMath>
+      <w:r>
+        <w:t xml:space="preserve"> </w:t>
+      </w:r>
+      <w:r>
+        <w:t xml:space="preserve">from 0 to 100. What</w:t>
+      </w:r>
+      <w:r>
+        <w:t xml:space="preserve"> </w:t>
+      </w:r>
+      <m:oMath>
+        <m:sSub>
+          <m:e>
+            <m:r>
+              <m:t>f</m:t>
+            </m:r>
+          </m:e>
+          <m:sub>
+            <m:r>
+              <m:rPr>
+                <m:sty m:val="p"/>
+              </m:rPr>
+              <m:t>P</m:t>
+            </m:r>
+            <m:r>
+              <m:rPr>
+                <m:sty m:val="p"/>
+              </m:rPr>
+              <m:t>W</m:t>
+            </m:r>
+            <m:r>
+              <m:rPr>
+                <m:sty m:val="p"/>
+              </m:rPr>
+              <m:t>M</m:t>
+            </m:r>
+          </m:sub>
+        </m:sSub>
+      </m:oMath>
+      <w:r>
+        <w:t xml:space="preserve"> </w:t>
+      </w:r>
+      <w:r>
+        <w:t xml:space="preserve">do you get, and what do you see?</w:t>
+      </w:r>
+    </w:p>
+    <w:p>
+      <w:pPr>
+        <w:numPr>
+          <w:ilvl w:val="1"/>
+          <w:numId w:val="1012"/>
+        </w:numPr>
+      </w:pPr>
+      <w:r>
+        <w:t xml:space="preserve">Use</w:t>
+      </w:r>
+      <w:r>
+        <w:t xml:space="preserve"> </w:t>
+      </w:r>
+      <m:oMath>
+        <m:r>
+          <m:t>M</m:t>
+        </m:r>
+        <m:r>
+          <m:rPr>
+            <m:sty m:val="p"/>
+          </m:rPr>
+          <m:t>=</m:t>
+        </m:r>
+        <m:r>
+          <m:t>N</m:t>
+        </m:r>
+        <m:r>
+          <m:rPr>
+            <m:sty m:val="p"/>
+          </m:rPr>
+          <m:t>/</m:t>
+        </m:r>
+        <m:r>
+          <m:t>2</m:t>
+        </m:r>
+      </m:oMath>
+      <w:r>
+        <w:t xml:space="preserve"> </w:t>
+      </w:r>
+      <w:r>
+        <w:t xml:space="preserve">and reduce</w:t>
+      </w:r>
+      <w:r>
+        <w:t xml:space="preserve"> </w:t>
+      </w:r>
+      <m:oMath>
+        <m:r>
+          <m:t>N</m:t>
+        </m:r>
+      </m:oMath>
+      <w:r>
+        <w:t xml:space="preserve"> </w:t>
+      </w:r>
+      <w:r>
+        <w:t xml:space="preserve">until the flickering disappears. Note</w:t>
+      </w:r>
+      <w:r>
+        <w:t xml:space="preserve"> </w:t>
+      </w:r>
+      <m:oMath>
+        <m:r>
+          <m:t>N</m:t>
+        </m:r>
+      </m:oMath>
+      <w:r>
+        <w:t xml:space="preserve">,</w:t>
+      </w:r>
+      <w:r>
+        <w:t xml:space="preserve"> </w:t>
+      </w:r>
+      <m:oMath>
+        <m:sSub>
+          <m:e>
+            <m:r>
+              <m:t>f</m:t>
+            </m:r>
+          </m:e>
+          <m:sub>
+            <m:r>
+              <m:rPr>
+                <m:sty m:val="p"/>
+              </m:rPr>
+              <m:t>P</m:t>
+            </m:r>
+            <m:r>
+              <m:rPr>
+                <m:sty m:val="p"/>
+              </m:rPr>
+              <m:t>W</m:t>
+            </m:r>
+            <m:r>
+              <m:rPr>
+                <m:sty m:val="p"/>
+              </m:rPr>
+              <m:t>M</m:t>
+            </m:r>
+          </m:sub>
+        </m:sSub>
+      </m:oMath>
+      <w:r>
+        <w:t xml:space="preserve"> </w:t>
+      </w:r>
+      <w:r>
+        <w:t xml:space="preserve">and the</w:t>
+      </w:r>
+      <w:r>
+        <w:t xml:space="preserve"> </w:t>
+      </w:r>
+      <w:r>
+        <w:t xml:space="preserve">number of duty levels that are left. Explain what you see and the trade-off you had to make.</w:t>
+      </w:r>
+    </w:p>
+    <w:p>
+      <w:pPr>
+        <w:numPr>
+          <w:ilvl w:val="1"/>
+          <w:numId w:val="1012"/>
+        </w:numPr>
+      </w:pPr>
+      <w:r>
+        <w:t xml:space="preserve">Calculate the</w:t>
+      </w:r>
+      <w:r>
+        <w:t xml:space="preserve"> </w:t>
+      </w:r>
+      <m:oMath>
+        <m:r>
+          <m:t>N</m:t>
+        </m:r>
+      </m:oMath>
+      <w:r>
+        <w:t xml:space="preserve"> </w:t>
+      </w:r>
+      <w:r>
+        <w:t xml:space="preserve">needed for the 17 kHz PWM that TIM2 uses for the motors, and explain why it cannot</w:t>
+      </w:r>
+      <w:r>
+        <w:t xml:space="preserve"> </w:t>
+      </w:r>
+      <w:r>
+        <w:t xml:space="preserve">be done with</w:t>
+      </w:r>
+      <w:r>
+        <w:t xml:space="preserve"> </w:t>
+      </w:r>
+      <w:r>
+        <w:rPr>
+          <w:rStyle w:val="VerbatimChar"/>
+        </w:rPr>
+        <w:t xml:space="preserve">HAL_GetTick</w:t>
+      </w:r>
+      <w:r>
+        <w:t xml:space="preserve">.</w:t>
+      </w:r>
+    </w:p>
+    <w:p>
+      <w:pPr>
+        <w:numPr>
+          <w:ilvl w:val="0"/>
+          <w:numId w:val="1011"/>
+        </w:numPr>
+      </w:pPr>
+      <w:r>
+        <w:t xml:space="preserve">Method 2, interrupt, with TIM7 at 10 kHz (</w:t>
+      </w:r>
+      <m:oMath>
+        <m:sSub>
+          <m:e>
+            <m:r>
+              <m:t>t</m:t>
+            </m:r>
+          </m:e>
+          <m:sub>
+            <m:r>
+              <m:rPr>
+                <m:sty m:val="p"/>
+              </m:rPr>
+              <m:t>s</m:t>
+            </m:r>
+            <m:r>
+              <m:rPr>
+                <m:sty m:val="p"/>
+              </m:rPr>
+              <m:t>t</m:t>
+            </m:r>
+            <m:r>
+              <m:rPr>
+                <m:sty m:val="p"/>
+              </m:rPr>
+              <m:t>e</m:t>
+            </m:r>
+            <m:r>
+              <m:rPr>
+                <m:sty m:val="p"/>
+              </m:rPr>
+              <m:t>p</m:t>
+            </m:r>
+          </m:sub>
+        </m:sSub>
+        <m:r>
+          <m:rPr>
+            <m:sty m:val="p"/>
+          </m:rPr>
+          <m:t>=</m:t>
+        </m:r>
+        <m:r>
+          <m:t>100</m:t>
+        </m:r>
+        <m:r>
+          <m:t> </m:t>
+        </m:r>
+        <m:r>
+          <m:t>μ</m:t>
+        </m:r>
+      </m:oMath>
+      <w:r>
+        <w:t xml:space="preserve">s, see the configuration section) and</w:t>
+      </w:r>
+      <w:r>
+        <w:t xml:space="preserve"> </w:t>
+      </w:r>
+      <w:r>
+        <w:t xml:space="preserve">the same</w:t>
+      </w:r>
+      <w:r>
+        <w:t xml:space="preserve"> </w:t>
+      </w:r>
+      <m:oMath>
+        <m:r>
+          <m:t>N</m:t>
+        </m:r>
+      </m:oMath>
+      <w:r>
+        <w:t xml:space="preserve"> </w:t>
+      </w:r>
+      <w:r>
+        <w:t xml:space="preserve">and</w:t>
+      </w:r>
+      <w:r>
+        <w:t xml:space="preserve"> </w:t>
+      </w:r>
+      <m:oMath>
+        <m:r>
+          <m:t>M</m:t>
+        </m:r>
+      </m:oMath>
+      <w:r>
+        <w:t xml:space="preserve"> </w:t>
+      </w:r>
+      <w:r>
+        <w:t xml:space="preserve">as in A.1.</w:t>
+      </w:r>
+    </w:p>
+    <w:p>
+      <w:pPr>
+        <w:numPr>
+          <w:ilvl w:val="1"/>
+          <w:numId w:val="1013"/>
+        </w:numPr>
+      </w:pPr>
+      <w:r>
+        <w:t xml:space="preserve">On LD2, with</w:t>
+      </w:r>
+      <w:r>
+        <w:t xml:space="preserve"> </w:t>
+      </w:r>
+      <m:oMath>
+        <m:r>
+          <m:t>N</m:t>
+        </m:r>
+        <m:r>
+          <m:rPr>
+            <m:sty m:val="p"/>
+          </m:rPr>
+          <m:t>=</m:t>
+        </m:r>
+        <m:r>
+          <m:t>100</m:t>
+        </m:r>
+      </m:oMath>
+      <w:r>
+        <w:t xml:space="preserve">: what</w:t>
+      </w:r>
+      <w:r>
+        <w:t xml:space="preserve"> </w:t>
+      </w:r>
+      <m:oMath>
+        <m:sSub>
+          <m:e>
+            <m:r>
+              <m:t>f</m:t>
+            </m:r>
+          </m:e>
+          <m:sub>
+            <m:r>
+              <m:rPr>
+                <m:sty m:val="p"/>
+              </m:rPr>
+              <m:t>P</m:t>
+            </m:r>
+            <m:r>
+              <m:rPr>
+                <m:sty m:val="p"/>
+              </m:rPr>
+              <m:t>W</m:t>
+            </m:r>
+            <m:r>
+              <m:rPr>
+                <m:sty m:val="p"/>
+              </m:rPr>
+              <m:t>M</m:t>
+            </m:r>
+          </m:sub>
+        </m:sSub>
+      </m:oMath>
+      <w:r>
+        <w:t xml:space="preserve"> </w:t>
+      </w:r>
+      <w:r>
+        <w:t xml:space="preserve">do you get now, and does the LED flicker?</w:t>
+      </w:r>
+    </w:p>
+    <w:p>
+      <w:pPr>
+        <w:numPr>
+          <w:ilvl w:val="1"/>
+          <w:numId w:val="1013"/>
+        </w:numPr>
+      </w:pPr>
+      <w:r>
+        <w:t xml:space="preserve">On wheel 1: in the callback, write 0 or 10 000 to</w:t>
+      </w:r>
+      <w:r>
+        <w:t xml:space="preserve"> </w:t>
+      </w:r>
+      <w:r>
+        <w:rPr>
+          <w:rStyle w:val="VerbatimChar"/>
+        </w:rPr>
+        <w:t xml:space="preserve">TIM2-&gt;CCR1</w:t>
+      </w:r>
+      <w:r>
+        <w:t xml:space="preserve"> </w:t>
+      </w:r>
+      <w:r>
+        <w:t xml:space="preserve">(fully off or fully on). Try</w:t>
+      </w:r>
+      <w:r>
+        <w:t xml:space="preserve"> </w:t>
+      </w:r>
+      <m:oMath>
+        <m:r>
+          <m:t>N</m:t>
+        </m:r>
+        <m:r>
+          <m:rPr>
+            <m:sty m:val="p"/>
+          </m:rPr>
+          <m:t>=</m:t>
+        </m:r>
+        <m:r>
+          <m:t>100</m:t>
+        </m:r>
+      </m:oMath>
+      <w:r>
+        <w:t xml:space="preserve"> </w:t>
+      </w:r>
+      <w:r>
+        <w:t xml:space="preserve">and</w:t>
+      </w:r>
+      <w:r>
+        <w:t xml:space="preserve"> </w:t>
+      </w:r>
+      <m:oMath>
+        <m:r>
+          <m:t>N</m:t>
+        </m:r>
+        <m:r>
+          <m:rPr>
+            <m:sty m:val="p"/>
+          </m:rPr>
+          <m:t>=</m:t>
+        </m:r>
+        <m:r>
+          <m:t>10</m:t>
+        </m:r>
+      </m:oMath>
+      <w:r>
+        <w:t xml:space="preserve"> </w:t>
+      </w:r>
+      <w:r>
+        <w:t xml:space="preserve">at 50 % duty, and describe the motion and the sound of the wheel.</w:t>
+      </w:r>
+      <w:r>
+        <w:t xml:space="preserve"> </w:t>
+      </w:r>
+      <w:r>
+        <w:rPr>
+          <w:rStyle w:val="Colorred"/>
+        </w:rPr>
+        <w:t xml:space="preserve">[For Bucher, delete before publishing: what is the electrical time constant</w:t>
+      </w:r>
+      <w:r>
+        <w:rPr>
+          <w:rStyle w:val="Colorred"/>
+        </w:rPr>
+        <w:t xml:space="preserve"> </w:t>
+      </w:r>
+      <m:oMath>
+        <m:r>
+          <m:t>L</m:t>
+        </m:r>
+        <m:r>
+          <m:rPr>
+            <m:sty m:val="p"/>
+          </m:rPr>
+          <m:t>/</m:t>
+        </m:r>
+        <m:r>
+          <m:t>R</m:t>
+        </m:r>
+      </m:oMath>
+      <w:r>
+        <w:rPr>
+          <w:rStyle w:val="Colorred"/>
+        </w:rPr>
+        <w:t xml:space="preserve"> </w:t>
+      </w:r>
+      <w:r>
+        <w:rPr>
+          <w:rStyle w:val="Colorred"/>
+        </w:rPr>
+        <w:t xml:space="preserve">of the cart’s</w:t>
+      </w:r>
+      <w:r>
+        <w:rPr>
+          <w:rStyle w:val="Colorred"/>
+        </w:rPr>
+        <w:t xml:space="preserve"> </w:t>
+      </w:r>
+      <w:r>
+        <w:rPr>
+          <w:rStyle w:val="Colorred"/>
+        </w:rPr>
+        <w:t xml:space="preserve">motor windings? Can we write that it is about 1 ms? Then at 100 Hz (5 ms on, 5 ms off) the PWM is not</w:t>
+      </w:r>
+      <w:r>
+        <w:rPr>
+          <w:rStyle w:val="Colorred"/>
+        </w:rPr>
+        <w:t xml:space="preserve"> </w:t>
+      </w:r>
+      <w:r>
+        <w:rPr>
+          <w:rStyle w:val="Colorred"/>
+        </w:rPr>
+        <w:t xml:space="preserve">fast enough compared with it: the current rises and falls fully in every period, the torque comes in</w:t>
+      </w:r>
+      <w:r>
+        <w:rPr>
+          <w:rStyle w:val="Colorred"/>
+        </w:rPr>
+        <w:t xml:space="preserve"> </w:t>
+      </w:r>
+      <w:r>
+        <w:rPr>
+          <w:rStyle w:val="Colorred"/>
+        </w:rPr>
+        <w:t xml:space="preserve">pulses, and the motor is very loud.]</w:t>
+      </w:r>
+    </w:p>
+    <w:p>
+      <w:pPr>
+        <w:numPr>
+          <w:ilvl w:val="1"/>
+          <w:numId w:val="1013"/>
+        </w:numPr>
+      </w:pPr>
+      <w:r>
+        <w:t xml:space="preserve">Try to make the motors’ PWM with method 2: 17 kHz with</w:t>
+      </w:r>
+      <w:r>
+        <w:t xml:space="preserve"> </w:t>
+      </w:r>
+      <m:oMath>
+        <m:r>
+          <m:t>N</m:t>
+        </m:r>
+        <m:r>
+          <m:rPr>
+            <m:sty m:val="p"/>
+          </m:rPr>
+          <m:t>=</m:t>
+        </m:r>
+        <m:r>
+          <m:t>100</m:t>
+        </m:r>
+      </m:oMath>
+      <w:r>
+        <w:t xml:space="preserve">. Which TIM7 settings (PSC, ARR) does</w:t>
+      </w:r>
+      <w:r>
+        <w:t xml:space="preserve"> </w:t>
+      </w:r>
+      <w:r>
+        <w:t xml:space="preserve">it need, and would it work? Try it, and print the number of main-loop passes per second at 10 kHz and</w:t>
+      </w:r>
+      <w:r>
+        <w:t xml:space="preserve"> </w:t>
+      </w:r>
+      <w:r>
+        <w:t xml:space="preserve">at the new rate.</w:t>
+      </w:r>
+    </w:p>
+    <w:p>
+      <w:pPr>
+        <w:numPr>
+          <w:ilvl w:val="1"/>
+          <w:numId w:val="1013"/>
+        </w:numPr>
+      </w:pPr>
+      <w:r>
+        <w:t xml:space="preserve">Measure how long one update of an RGB LED takes over I2C (time 1000 calls of</w:t>
+      </w:r>
+      <w:r>
+        <w:t xml:space="preserve"> </w:t>
+      </w:r>
+      <w:r>
+        <w:rPr>
+          <w:rStyle w:val="VerbatimChar"/>
+        </w:rPr>
+        <w:t xml:space="preserve">setLedChannel</w:t>
+      </w:r>
+      <w:r>
+        <w:t xml:space="preserve"> </w:t>
+      </w:r>
+      <w:r>
+        <w:t xml:space="preserve">with</w:t>
+      </w:r>
+      <w:r>
+        <w:t xml:space="preserve"> </w:t>
+      </w:r>
+      <w:r>
+        <w:rPr>
+          <w:rStyle w:val="VerbatimChar"/>
+        </w:rPr>
+        <w:t xml:space="preserve">HAL_GetTick</w:t>
+      </w:r>
+      <w:r>
+        <w:t xml:space="preserve">). Explain why method 2 cannot drive the RGB LEDs from the TIM7 callback.</w:t>
+      </w:r>
+    </w:p>
+    <w:p>
+      <w:pPr>
+        <w:numPr>
+          <w:ilvl w:val="0"/>
+          <w:numId w:val="1011"/>
+        </w:numPr>
+      </w:pPr>
+      <w:r>
+        <w:t xml:space="preserve">Method 3, hardware, on wheel 1: TIM2 runs at 17 kHz with</w:t>
+      </w:r>
+      <w:r>
+        <w:t xml:space="preserve"> </w:t>
+      </w:r>
+      <m:oMath>
+        <m:r>
+          <m:t>N</m:t>
+        </m:r>
+        <m:r>
+          <m:rPr>
+            <m:sty m:val="p"/>
+          </m:rPr>
+          <m:t>=</m:t>
+        </m:r>
+        <m:r>
+          <m:t>10</m:t>
+        </m:r>
+        <m:r>
+          <m:t> </m:t>
+        </m:r>
+        <m:r>
+          <m:t>000</m:t>
+        </m:r>
+      </m:oMath>
+      <w:r>
+        <w:t xml:space="preserve">, and</w:t>
+      </w:r>
+      <w:r>
+        <w:t xml:space="preserve"> </w:t>
+      </w:r>
+      <w:r>
+        <w:rPr>
+          <w:rStyle w:val="VerbatimChar"/>
+        </w:rPr>
+        <w:t xml:space="preserve">TIM2-&gt;CCR1</w:t>
+      </w:r>
+      <w:r>
+        <w:t xml:space="preserve"> </w:t>
+      </w:r>
+      <w:r>
+        <w:t xml:space="preserve">sets</w:t>
+      </w:r>
+      <w:r>
+        <w:t xml:space="preserve"> </w:t>
+      </w:r>
+      <m:oMath>
+        <m:r>
+          <m:t>M</m:t>
+        </m:r>
+      </m:oMath>
+      <w:r>
+        <w:t xml:space="preserve">.</w:t>
+      </w:r>
+      <w:r>
+        <w:t xml:space="preserve"> </w:t>
+      </w:r>
+      <w:r>
+        <w:t xml:space="preserve">Sweep the duty from 0 to 100 % in steps of 5 % and find the smallest duty at which the wheel starts to</w:t>
+      </w:r>
+      <w:r>
+        <w:t xml:space="preserve"> </w:t>
+      </w:r>
+      <w:r>
+        <w:t xml:space="preserve">turn. On the RGB LEDs, set the brightness of LED 0 once with</w:t>
+      </w:r>
+      <w:r>
+        <w:t xml:space="preserve"> </w:t>
+      </w:r>
+      <w:r>
+        <w:rPr>
+          <w:rStyle w:val="VerbatimChar"/>
+        </w:rPr>
+        <w:t xml:space="preserve">setLedChannel</w:t>
+      </w:r>
+      <w:r>
+        <w:t xml:space="preserve"> </w:t>
+      </w:r>
+      <w:r>
+        <w:t xml:space="preserve">(the PCA9634 chip has its</w:t>
+      </w:r>
+      <w:r>
+        <w:t xml:space="preserve"> </w:t>
+      </w:r>
+      <w:r>
+        <w:t xml:space="preserve">own hardware PWM). Count the main-loop passes per second again.</w:t>
+      </w:r>
+    </w:p>
+    <w:p>
+      <w:pPr>
+        <w:numPr>
+          <w:ilvl w:val="0"/>
+          <w:numId w:val="1011"/>
+        </w:numPr>
+      </w:pPr>
+      <w:r>
+        <w:t xml:space="preserve">Compare the three methods in a table:</w:t>
+      </w:r>
+      <w:r>
+        <w:t xml:space="preserve"> </w:t>
+      </w:r>
+      <m:oMath>
+        <m:sSub>
+          <m:e>
+            <m:r>
+              <m:t>t</m:t>
+            </m:r>
+          </m:e>
+          <m:sub>
+            <m:r>
+              <m:rPr>
+                <m:sty m:val="p"/>
+              </m:rPr>
+              <m:t>s</m:t>
+            </m:r>
+            <m:r>
+              <m:rPr>
+                <m:sty m:val="p"/>
+              </m:rPr>
+              <m:t>t</m:t>
+            </m:r>
+            <m:r>
+              <m:rPr>
+                <m:sty m:val="p"/>
+              </m:rPr>
+              <m:t>e</m:t>
+            </m:r>
+            <m:r>
+              <m:rPr>
+                <m:sty m:val="p"/>
+              </m:rPr>
+              <m:t>p</m:t>
+            </m:r>
+          </m:sub>
+        </m:sSub>
+      </m:oMath>
+      <w:r>
+        <w:t xml:space="preserve">,</w:t>
+      </w:r>
+      <w:r>
+        <w:t xml:space="preserve"> </w:t>
+      </w:r>
+      <m:oMath>
+        <m:sSub>
+          <m:e>
+            <m:r>
+              <m:t>f</m:t>
+            </m:r>
+          </m:e>
+          <m:sub>
+            <m:r>
+              <m:rPr>
+                <m:sty m:val="p"/>
+              </m:rPr>
+              <m:t>P</m:t>
+            </m:r>
+            <m:r>
+              <m:rPr>
+                <m:sty m:val="p"/>
+              </m:rPr>
+              <m:t>W</m:t>
+            </m:r>
+            <m:r>
+              <m:rPr>
+                <m:sty m:val="p"/>
+              </m:rPr>
+              <m:t>M</m:t>
+            </m:r>
+          </m:sub>
+        </m:sSub>
+      </m:oMath>
+      <w:r>
+        <w:t xml:space="preserve">,</w:t>
+      </w:r>
+      <w:r>
+        <w:t xml:space="preserve"> </w:t>
+      </w:r>
+      <m:oMath>
+        <m:r>
+          <m:t>N</m:t>
+        </m:r>
+      </m:oMath>
+      <w:r>
+        <w:t xml:space="preserve"> </w:t>
+      </w:r>
+      <w:r>
+        <w:t xml:space="preserve">(duty levels), main-loop passes per second,</w:t>
+      </w:r>
+      <w:r>
+        <w:t xml:space="preserve"> </w:t>
+      </w:r>
+      <w:r>
+        <w:t xml:space="preserve">and what you see and hear, on LD2, on the RGB LED and on the wheel. Explain which method suits an LED and which</w:t>
+      </w:r>
+      <w:r>
+        <w:t xml:space="preserve"> </w:t>
+      </w:r>
+      <w:r>
+        <w:t xml:space="preserve">a motor, and why.</w:t>
+      </w:r>
+    </w:p>
+    <w:bookmarkEnd w:id="27"/>
+    <w:bookmarkStart w:id="28" w:name="part-b-polling-vs.-interrupts."/>
+    <w:p>
+      <w:pPr>
+        <w:pStyle w:val="Heading4"/>
+      </w:pPr>
+      <w:r>
+        <w:t xml:space="preserve">Part B: Polling vs. interrupts.</w:t>
+      </w:r>
+    </w:p>
+    <w:p>
+      <w:pPr>
+        <w:pStyle w:val="FirstParagraph"/>
+      </w:pPr>
+      <w:r>
+        <w:t xml:space="preserve">Wheel 1 turns at a constant duty of 40 %. It must stop as soon as the IR sensor detects an obstacle</w:t>
+      </w:r>
+      <w:r>
+        <w:t xml:space="preserve"> </w:t>
+      </w:r>
+      <w:r>
+        <w:rPr>
+          <w:b/>
+          <w:bCs/>
+        </w:rPr>
+        <w:t xml:space="preserve">or</w:t>
+      </w:r>
+      <w:r>
+        <w:t xml:space="preserve"> </w:t>
+      </w:r>
+      <w:r>
+        <w:t xml:space="preserve">the</w:t>
+      </w:r>
+      <w:r>
+        <w:t xml:space="preserve"> </w:t>
+      </w:r>
+      <w:r>
+        <w:t xml:space="preserve">ultrasonic sensor measures a distance below 15 cm, and it may start again only after both have been clear for 1 s.</w:t>
+      </w:r>
+      <w:r>
+        <w:t xml:space="preserve"> </w:t>
+      </w:r>
+      <w:r>
+        <w:t xml:space="preserve">The main loop also does the</w:t>
+      </w:r>
+      <w:r>
+        <w:t xml:space="preserve"> </w:t>
+      </w:r>
+      <w:r>
+        <w:t xml:space="preserve">“rest of the program”</w:t>
+      </w:r>
+      <w:r>
+        <w:t xml:space="preserve">: it updates all 8 RGB LEDs (green while the wheel turns, red while</w:t>
+      </w:r>
+      <w:r>
+        <w:t xml:space="preserve"> </w:t>
+      </w:r>
+      <w:r>
+        <w:t xml:space="preserve">it is stopped), prints one status line, and then calls</w:t>
+      </w:r>
+      <w:r>
+        <w:t xml:space="preserve"> </w:t>
+      </w:r>
+      <w:r>
+        <w:rPr>
+          <w:rStyle w:val="VerbatimChar"/>
+        </w:rPr>
+        <w:t xml:space="preserve">HAL_Delay(150)</w:t>
+      </w:r>
+      <w:r>
+        <w:t xml:space="preserve"> </w:t>
+      </w:r>
+      <w:r>
+        <w:t xml:space="preserve">to stand for other work. Keep this</w:t>
+      </w:r>
+      <w:r>
+        <w:t xml:space="preserve"> </w:t>
+      </w:r>
+      <w:r>
+        <w:t xml:space="preserve">workload in both versions.</w:t>
+      </w:r>
+    </w:p>
+    <w:p>
+      <w:pPr>
+        <w:numPr>
+          <w:ilvl w:val="0"/>
+          <w:numId w:val="1014"/>
+        </w:numPr>
+      </w:pPr>
+      <w:r>
+        <w:t xml:space="preserve">Without any interrupts. Disable the IR interrupt with</w:t>
+      </w:r>
+      <w:r>
+        <w:t xml:space="preserve"> </w:t>
+      </w:r>
+      <w:r>
+        <w:rPr>
+          <w:rStyle w:val="VerbatimChar"/>
+        </w:rPr>
+        <w:t xml:space="preserve">HAL_NVIC_DisableIRQ(EXTI9_5_IRQn)</w:t>
+      </w:r>
+      <w:r>
+        <w:t xml:space="preserve">, read PA7</w:t>
+      </w:r>
+      <w:r>
+        <w:t xml:space="preserve"> </w:t>
+      </w:r>
+      <w:r>
+        <w:t xml:space="preserve">with</w:t>
+      </w:r>
+      <w:r>
+        <w:t xml:space="preserve"> </w:t>
+      </w:r>
+      <w:r>
+        <w:rPr>
+          <w:rStyle w:val="VerbatimChar"/>
+        </w:rPr>
+        <w:t xml:space="preserve">HAL_GPIO_ReadPin</w:t>
+      </w:r>
+      <w:r>
+        <w:t xml:space="preserve">, and start the echo capture with</w:t>
+      </w:r>
+      <w:r>
+        <w:t xml:space="preserve"> </w:t>
+      </w:r>
+      <w:r>
+        <w:rPr>
+          <w:rStyle w:val="VerbatimChar"/>
+        </w:rPr>
+        <w:t xml:space="preserve">HAL_TIM_IC_Start</w:t>
+      </w:r>
+      <w:r>
+        <w:t xml:space="preserve"> </w:t>
+      </w:r>
+      <w:r>
+        <w:t xml:space="preserve">(not the</w:t>
+      </w:r>
+      <w:r>
+        <w:t xml:space="preserve"> </w:t>
+      </w:r>
+      <w:r>
+        <w:rPr>
+          <w:rStyle w:val="VerbatimChar"/>
+        </w:rPr>
+        <w:t xml:space="preserve">_IT</w:t>
+      </w:r>
+      <w:r>
+        <w:t xml:space="preserve"> </w:t>
+      </w:r>
+      <w:r>
+        <w:t xml:space="preserve">version). Read each captured edge by polling the capture flag of TIM5 channel 2</w:t>
+      </w:r>
+      <w:r>
+        <w:t xml:space="preserve"> </w:t>
+      </w:r>
+      <w:r>
+        <w:t xml:space="preserve">(</w:t>
+      </w:r>
+      <w:r>
+        <w:rPr>
+          <w:rStyle w:val="VerbatimChar"/>
+        </w:rPr>
+        <w:t xml:space="preserve">__HAL_TIM_GET_FLAG(&amp;htim5, TIM_FLAG_CC2)</w:t>
+      </w:r>
+      <w:r>
+        <w:t xml:space="preserve">, then the captured value with</w:t>
+      </w:r>
+      <w:r>
+        <w:t xml:space="preserve"> </w:t>
+      </w:r>
+      <w:r>
+        <w:rPr>
+          <w:rStyle w:val="VerbatimChar"/>
+        </w:rPr>
+        <w:t xml:space="preserve">HAL_TIM_ReadCapturedValue</w:t>
+      </w:r>
+      <w:r>
+        <w:t xml:space="preserve">). Then test:</w:t>
+      </w:r>
+    </w:p>
+    <w:p>
+      <w:pPr>
+        <w:numPr>
+          <w:ilvl w:val="1"/>
+          <w:numId w:val="1015"/>
+        </w:numPr>
+      </w:pPr>
+      <w:r>
+        <w:t xml:space="preserve">Move a hand quickly past the IR sensor, 10 times. How many times did the wheel stop?</w:t>
+      </w:r>
+    </w:p>
+    <w:p>
+      <w:pPr>
+        <w:numPr>
+          <w:ilvl w:val="1"/>
+          <w:numId w:val="1015"/>
+        </w:numPr>
+      </w:pPr>
+      <w:r>
+        <w:t xml:space="preserve">Over 10 s, how many of the 100 ultrasonic measurements (one every 100 ms) gave a distance?</w:t>
+      </w:r>
+    </w:p>
+    <w:p>
+      <w:pPr>
+        <w:numPr>
+          <w:ilvl w:val="1"/>
+          <w:numId w:val="1015"/>
+        </w:numPr>
+      </w:pPr>
+      <w:r>
+        <w:t xml:space="preserve">Measure the loop period with</w:t>
+      </w:r>
+      <w:r>
+        <w:t xml:space="preserve"> </w:t>
+      </w:r>
+      <w:r>
+        <w:rPr>
+          <w:rStyle w:val="VerbatimChar"/>
+        </w:rPr>
+        <w:t xml:space="preserve">HAL_GetTick</w:t>
+      </w:r>
+      <w:r>
+        <w:t xml:space="preserve">. From it, give the worst-case time from an obstacle</w:t>
+      </w:r>
+      <w:r>
+        <w:t xml:space="preserve"> </w:t>
+      </w:r>
+      <w:r>
+        <w:t xml:space="preserve">appearing to the wheel stopping, and the angle the wheel turns in that time at 40 % duty (use your</w:t>
+      </w:r>
+      <w:r>
+        <w:t xml:space="preserve"> </w:t>
+      </w:r>
+      <w:r>
+        <w:t xml:space="preserve">speed measurement from Part D or estimate it from the video).</w:t>
+      </w:r>
+    </w:p>
+    <w:p>
+      <w:pPr>
+        <w:numPr>
+          <w:ilvl w:val="0"/>
+          <w:numId w:val="1014"/>
+        </w:numPr>
+      </w:pPr>
+      <w:r>
+        <w:t xml:space="preserve">With interrupts. Use the EXTI interrupt of PA7 (both edges) and the TIM5 input-capture interrupt</w:t>
+      </w:r>
+      <w:r>
+        <w:t xml:space="preserve"> </w:t>
+      </w:r>
+      <w:r>
+        <w:t xml:space="preserve">(</w:t>
+      </w:r>
+      <w:r>
+        <w:rPr>
+          <w:rStyle w:val="VerbatimChar"/>
+        </w:rPr>
+        <w:t xml:space="preserve">HAL_TIM_IC_Start_IT</w:t>
+      </w:r>
+      <w:r>
+        <w:t xml:space="preserve">). The callbacks stop the wheel themselves, by writing 0 to</w:t>
+      </w:r>
+      <w:r>
+        <w:t xml:space="preserve"> </w:t>
+      </w:r>
+      <w:r>
+        <w:rPr>
+          <w:rStyle w:val="VerbatimChar"/>
+        </w:rPr>
+        <w:t xml:space="preserve">TIM2-&gt;CCR1</w:t>
+      </w:r>
+      <w:r>
+        <w:t xml:space="preserve">,</w:t>
+      </w:r>
+      <w:r>
+        <w:t xml:space="preserve"> </w:t>
+      </w:r>
+      <w:r>
+        <w:t xml:space="preserve">and set a flag; the main loop, with the same workload as in B.1, handles the LEDs and the restart. Repeat</w:t>
+      </w:r>
+      <w:r>
+        <w:t xml:space="preserve"> </w:t>
+      </w:r>
+      <w:r>
+        <w:t xml:space="preserve">tests (a) to (c).</w:t>
+      </w:r>
+    </w:p>
+    <w:p>
+      <w:pPr>
+        <w:pStyle w:val="FirstParagraph"/>
+      </w:pPr>
+      <w:r>
+        <w:t xml:space="preserve">In your report, compare B.1 and B.2 in a table and explain the difference. Explain also why the callback may write</w:t>
+      </w:r>
+      <w:r>
+        <w:t xml:space="preserve"> </w:t>
+      </w:r>
+      <w:r>
+        <w:rPr>
+          <w:rStyle w:val="VerbatimChar"/>
+        </w:rPr>
+        <w:t xml:space="preserve">TIM2-&gt;CCR1</w:t>
+      </w:r>
+      <w:r>
+        <w:t xml:space="preserve"> </w:t>
+      </w:r>
+      <w:r>
+        <w:t xml:space="preserve">but must not update the RGB LEDs, and which variables must be</w:t>
+      </w:r>
+      <w:r>
+        <w:t xml:space="preserve"> </w:t>
+      </w:r>
+      <w:r>
+        <w:rPr>
+          <w:rStyle w:val="VerbatimChar"/>
+        </w:rPr>
+        <w:t xml:space="preserve">volatile</w:t>
+      </w:r>
+      <w:r>
+        <w:t xml:space="preserve">. Show both</w:t>
+      </w:r>
+      <w:r>
+        <w:t xml:space="preserve"> </w:t>
+      </w:r>
+      <w:r>
+        <w:t xml:space="preserve">versions in the video, with the wheel continuing to turn in B.1.</w:t>
+      </w:r>
+    </w:p>
+    <w:bookmarkEnd w:id="28"/>
+    <w:bookmarkStart w:id="29" w:name="part-c-your-own-i2c-driver."/>
+    <w:p>
+      <w:pPr>
+        <w:pStyle w:val="Heading4"/>
+      </w:pPr>
+      <w:r>
+        <w:t xml:space="preserve">Part C: Your own I2C driver.</w:t>
+      </w:r>
+    </w:p>
+    <w:p>
+      <w:pPr>
+        <w:pStyle w:val="FirstParagraph"/>
+      </w:pPr>
+      <w:r>
+        <w:t xml:space="preserve">From now on the IO board is no longer a black box: do not use</w:t>
+      </w:r>
+      <w:r>
+        <w:t xml:space="preserve"> </w:t>
+      </w:r>
+      <w:r>
+        <w:rPr>
+          <w:rStyle w:val="VerbatimChar"/>
+        </w:rPr>
+        <w:t xml:space="preserve">io_board.c</w:t>
+      </w:r>
+      <w:r>
+        <w:t xml:space="preserve"> </w:t>
+      </w:r>
+      <w:r>
+        <w:t xml:space="preserve">in this part. Write your own</w:t>
+      </w:r>
+      <w:r>
+        <w:t xml:space="preserve"> </w:t>
+      </w:r>
+      <w:r>
+        <w:t xml:space="preserve">functions on top of</w:t>
+      </w:r>
+      <w:r>
+        <w:t xml:space="preserve"> </w:t>
+      </w:r>
+      <w:r>
+        <w:rPr>
+          <w:rStyle w:val="VerbatimChar"/>
+        </w:rPr>
+        <w:t xml:space="preserve">HAL_I2C_Mem_Write</w:t>
+      </w:r>
+      <w:r>
+        <w:t xml:space="preserve"> </w:t>
+      </w:r>
+      <w:r>
+        <w:t xml:space="preserve">and</w:t>
+      </w:r>
+      <w:r>
+        <w:t xml:space="preserve"> </w:t>
+      </w:r>
+      <w:r>
+        <w:rPr>
+          <w:rStyle w:val="VerbatimChar"/>
+        </w:rPr>
+        <w:t xml:space="preserve">HAL_I2C_Mem_Read</w:t>
+      </w:r>
+      <w:r>
+        <w:t xml:space="preserve">, using the datasheets of the</w:t>
+      </w:r>
+      <w:r>
+        <w:t xml:space="preserve"> </w:t>
+      </w:r>
+      <w:r>
+        <w:t xml:space="preserve">PCA9634, PCA9538A and PCA9685.</w:t>
+      </w:r>
+    </w:p>
+    <w:p>
+      <w:pPr>
+        <w:numPr>
+          <w:ilvl w:val="0"/>
+          <w:numId w:val="1016"/>
+        </w:numPr>
+      </w:pPr>
+      <w:r>
+        <w:t xml:space="preserve">Scan the bus: try every 7-bit address from 0x01 to 0x7F with</w:t>
+      </w:r>
+      <w:r>
+        <w:t xml:space="preserve"> </w:t>
+      </w:r>
+      <w:r>
+        <w:rPr>
+          <w:rStyle w:val="VerbatimChar"/>
+        </w:rPr>
+        <w:t xml:space="preserve">HAL_I2C_IsDeviceReady</w:t>
+      </w:r>
+      <w:r>
+        <w:t xml:space="preserve"> </w:t>
+      </w:r>
+      <w:r>
+        <w:t xml:space="preserve">and print the</w:t>
+      </w:r>
+      <w:r>
+        <w:t xml:space="preserve"> </w:t>
+      </w:r>
+      <w:r>
+        <w:t xml:space="preserve">addresses that answer. Compare the list with the table of devices in the configuration section. In your</w:t>
+      </w:r>
+      <w:r>
+        <w:t xml:space="preserve"> </w:t>
+      </w:r>
+      <w:r>
+        <w:t xml:space="preserve">report, explain what the STM32 sees on the bus when no chip has the address (ACK and NACK).</w:t>
+      </w:r>
+    </w:p>
+    <w:p>
+      <w:pPr>
+        <w:numPr>
+          <w:ilvl w:val="0"/>
+          <w:numId w:val="1016"/>
+        </w:numPr>
+      </w:pPr>
+      <w:r>
+        <w:t xml:space="preserve">LED driver. Write</w:t>
+      </w:r>
+      <w:r>
+        <w:t xml:space="preserve"> </w:t>
+      </w:r>
+      <w:r>
+        <w:rPr>
+          <w:rStyle w:val="VerbatimChar"/>
+        </w:rPr>
+        <w:t xml:space="preserve">ledChipInit(addr)</w:t>
+      </w:r>
+      <w:r>
+        <w:t xml:space="preserve"> </w:t>
+      </w:r>
+      <w:r>
+        <w:t xml:space="preserve">and</w:t>
+      </w:r>
+      <w:r>
+        <w:t xml:space="preserve"> </w:t>
+      </w:r>
+      <w:r>
+        <w:rPr>
+          <w:rStyle w:val="VerbatimChar"/>
+        </w:rPr>
+        <w:t xml:space="preserve">ledSetChannel(addr, channel, value)</w:t>
+      </w:r>
+      <w:r>
+        <w:t xml:space="preserve"> </w:t>
+      </w:r>
+      <w:r>
+        <w:t xml:space="preserve">for the</w:t>
+      </w:r>
+      <w:r>
+        <w:t xml:space="preserve"> </w:t>
+      </w:r>
+      <w:r>
+        <w:t xml:space="preserve">PCA9634, setting the registers the datasheet requires (mode registers, output mode of each channel, PWM</w:t>
+      </w:r>
+      <w:r>
+        <w:t xml:space="preserve"> </w:t>
+      </w:r>
+      <w:r>
+        <w:t xml:space="preserve">value). Use them to show a colour of your choice on each of the 8 RGB LEDs. In your report, list every</w:t>
+      </w:r>
+      <w:r>
+        <w:t xml:space="preserve"> </w:t>
+      </w:r>
+      <w:r>
+        <w:t xml:space="preserve">register you write and why. Note how the LEDs are wired: check whether a larger PWM value makes an LED</w:t>
+      </w:r>
+      <w:r>
+        <w:t xml:space="preserve"> </w:t>
+      </w:r>
+      <w:r>
+        <w:t xml:space="preserve">brighter or dimmer.</w:t>
+      </w:r>
+    </w:p>
+    <w:p>
+      <w:pPr>
+        <w:numPr>
+          <w:ilvl w:val="0"/>
+          <w:numId w:val="1016"/>
+        </w:numPr>
+      </w:pPr>
+      <w:r>
+        <w:t xml:space="preserve">One transaction or many. Set all 8 channels of one PCA9634 twice: once with 8 separate writes, and once with a</w:t>
+      </w:r>
+      <w:r>
+        <w:t xml:space="preserve"> </w:t>
+      </w:r>
+      <w:r>
+        <w:t xml:space="preserve">single write of 8 bytes using the chip’s auto-increment (see the control register in the datasheet). Time</w:t>
+      </w:r>
+      <w:r>
+        <w:t xml:space="preserve"> </w:t>
+      </w:r>
+      <w:r>
+        <w:t xml:space="preserve">1000 repetitions of each. From the I2C bit rate (100 kHz) and the number of bits in each transaction</w:t>
+      </w:r>
+      <w:r>
+        <w:t xml:space="preserve"> </w:t>
+      </w:r>
+      <w:r>
+        <w:t xml:space="preserve">(address, register, data, ACK bits, start and stop), calculate the expected times and compare them with your</w:t>
+      </w:r>
+      <w:r>
+        <w:t xml:space="preserve"> </w:t>
+      </w:r>
+      <w:r>
+        <w:t xml:space="preserve">measurements.</w:t>
+      </w:r>
+    </w:p>
+    <w:p>
+      <w:pPr>
+        <w:numPr>
+          <w:ilvl w:val="0"/>
+          <w:numId w:val="1016"/>
+        </w:numPr>
+      </w:pPr>
+      <w:r>
+        <w:t xml:space="preserve">Buttons. Read the input register of the PCA9538A with</w:t>
+      </w:r>
+      <w:r>
+        <w:t xml:space="preserve"> </w:t>
+      </w:r>
+      <w:r>
+        <w:rPr>
+          <w:rStyle w:val="VerbatimChar"/>
+        </w:rPr>
+        <w:t xml:space="preserve">HAL_I2C_Mem_Read</w:t>
+      </w:r>
+      <w:r>
+        <w:t xml:space="preserve"> </w:t>
+      </w:r>
+      <w:r>
+        <w:t xml:space="preserve">and print the state of the 4</w:t>
+      </w:r>
+      <w:r>
+        <w:t xml:space="preserve"> </w:t>
+      </w:r>
+      <w:r>
+        <w:t xml:space="preserve">buttons whenever it changes. Check and print the return value of every HAL I2C call; show what is printed</w:t>
+      </w:r>
+      <w:r>
+        <w:t xml:space="preserve"> </w:t>
+      </w:r>
+      <w:r>
+        <w:t xml:space="preserve">when you read from an address that has no chip.</w:t>
+      </w:r>
+    </w:p>
+    <w:p>
+      <w:pPr>
+        <w:numPr>
+          <w:ilvl w:val="0"/>
+          <w:numId w:val="1016"/>
+        </w:numPr>
+      </w:pPr>
+      <w:r>
+        <w:t xml:space="preserve">Servo. Initialise the PCA9685 for 50 Hz (PRESCALE = 121) and move the servo to 900, 1500 and 2100 </w:t>
+      </w:r>
+      <m:oMath>
+        <m:r>
+          <m:t>μ</m:t>
+        </m:r>
+      </m:oMath>
+      <w:r>
+        <w:t xml:space="preserve">s.</w:t>
+      </w:r>
+      <w:r>
+        <w:t xml:space="preserve"> </w:t>
+      </w:r>
+      <w:r>
+        <w:t xml:space="preserve">In your report, calculate the PWM frequency that PRESCALE = 121 gives, and the register values for each pulse</w:t>
+      </w:r>
+      <w:r>
+        <w:t xml:space="preserve"> </w:t>
+      </w:r>
+      <w:r>
+        <w:t xml:space="preserve">width.</w:t>
+      </w:r>
+      <w:r>
+        <w:t xml:space="preserve"> </w:t>
+      </w:r>
+      <w:r>
+        <w:rPr>
+          <w:rStyle w:val="Colorred"/>
+        </w:rPr>
+        <w:t xml:space="preserve">[For Bucher and Yohai, delete before publishing: confirm on the board which PCA9685 channel the servo is</w:t>
+      </w:r>
+      <w:r>
+        <w:rPr>
+          <w:rStyle w:val="Colorred"/>
+        </w:rPr>
+        <w:t xml:space="preserve"> </w:t>
+      </w:r>
+      <w:r>
+        <w:rPr>
+          <w:rStyle w:val="Colorred"/>
+        </w:rPr>
+        <w:t xml:space="preserve">on, and give it here.]</w:t>
+      </w:r>
+    </w:p>
+    <w:bookmarkEnd w:id="29"/>
+    <w:bookmarkStart w:id="30" w:name="part-d-encoders-and-wheel-speed."/>
+    <w:p>
+      <w:pPr>
+        <w:pStyle w:val="Heading4"/>
+      </w:pPr>
+      <w:r>
+        <w:t xml:space="preserve">Part D: Encoders and wheel speed.</w:t>
+      </w:r>
+    </w:p>
+    <w:p>
+      <w:pPr>
+        <w:numPr>
+          <w:ilvl w:val="0"/>
+          <w:numId w:val="1017"/>
+        </w:numPr>
+      </w:pPr>
+      <w:r>
+        <w:t xml:space="preserve">Encoder resolution. The encoder timer of wheel 1 (TIM1) can count in</w:t>
+      </w:r>
+      <w:r>
+        <w:t xml:space="preserve"> </w:t>
       </w:r>
       <w:r>
         <w:rPr>
           <w:i/>
           <w:iCs/>
         </w:rPr>
+        <w:t xml:space="preserve">Encoder Mode TI1</w:t>
+      </w:r>
+      <w:r>
+        <w:t xml:space="preserve"> </w:t>
+      </w:r>
+      <w:r>
+        <w:t xml:space="preserve">or in</w:t>
+      </w:r>
+      <w:r>
+        <w:t xml:space="preserve"> </w:t>
+      </w:r>
+      <w:r>
+        <w:rPr>
+          <w:i/>
+          <w:iCs/>
+        </w:rPr>
+        <w:t xml:space="preserve">Encoder</w:t>
+      </w:r>
+      <w:r>
+        <w:rPr>
+          <w:i/>
+          <w:iCs/>
+        </w:rPr>
+        <w:t xml:space="preserve"> </w:t>
+      </w:r>
+      <w:r>
+        <w:rPr>
+          <w:i/>
+          <w:iCs/>
+        </w:rPr>
+        <w:t xml:space="preserve">Mode TI1 and TI2</w:t>
+      </w:r>
+      <w:r>
+        <w:t xml:space="preserve">. With the motor power off, mark the wheel and turn it by hand exactly 5 revolutions forward,</w:t>
+      </w:r>
+      <w:r>
+        <w:t xml:space="preserve"> </w:t>
+      </w:r>
+      <w:r>
+        <w:t xml:space="preserve">then 5 back, and print the counter before and after. Do it with each of the two settings (change it in</w:t>
+      </w:r>
+      <w:r>
+        <w:t xml:space="preserve"> </w:t>
+      </w:r>
+      <w:r>
+        <w:rPr>
+          <w:rStyle w:val="VerbatimChar"/>
+        </w:rPr>
+        <w:t xml:space="preserve">ass2.ioc</w:t>
+      </w:r>
+      <w:r>
+        <w:t xml:space="preserve"> </w:t>
+      </w:r>
+      <w:r>
+        <w:t xml:space="preserve">and generate the code again). Give the counts per revolution and the resolution in degrees for</w:t>
+      </w:r>
+      <w:r>
+        <w:t xml:space="preserve"> </w:t>
+      </w:r>
+      <w:r>
+        <w:t xml:space="preserve">each setting, and explain the factor between them from the A and B signals of a quadrature encoder.</w:t>
+      </w:r>
+    </w:p>
+    <w:p>
+      <w:pPr>
+        <w:numPr>
+          <w:ilvl w:val="0"/>
+          <w:numId w:val="1017"/>
+        </w:numPr>
+      </w:pPr>
+      <w:r>
+        <w:t xml:space="preserve">Speed and wrap-around. In the 100 Hz interrupt of TIM6, read the counter of TIM1 and compute the wheel speed</w:t>
+      </w:r>
+      <w:r>
+        <w:t xml:space="preserve"> </w:t>
+      </w:r>
+      <w:r>
+        <w:t xml:space="preserve">from the change since the previous sample. The counter is 16 bits wide, so it wraps around (65 535</w:t>
+      </w:r>
+      <w:r>
         <w:t xml:space="preserve"> </w:t>
       </w:r>
       <m:oMath>
@@ -5330,17 +7514,521 @@
         </m:r>
       </m:oMath>
       <w:r>
+        <w:t xml:space="preserve"> </w:t>
+      </w:r>
+      <w:r>
+        <w:t xml:space="preserve">0</w:t>
+      </w:r>
+      <w:r>
+        <w:t xml:space="preserve"> </w:t>
+      </w:r>
+      <w:r>
+        <w:t xml:space="preserve">forward, 0</w:t>
+      </w:r>
+      <w:r>
+        <w:t xml:space="preserve"> </w:t>
+      </w:r>
+      <m:oMath>
+        <m:r>
+          <m:rPr>
+            <m:sty m:val="p"/>
+          </m:rPr>
+          <m:t>→</m:t>
+        </m:r>
+      </m:oMath>
+      <w:r>
+        <w:t xml:space="preserve"> </w:t>
+      </w:r>
+      <w:r>
+        <w:t xml:space="preserve">65 535 backward). Compute the change in two ways:</w:t>
+      </w:r>
+    </w:p>
+    <w:p>
+      <w:pPr>
+        <w:numPr>
+          <w:ilvl w:val="1"/>
+          <w:numId w:val="1018"/>
+        </w:numPr>
+      </w:pPr>
+      <w:r>
+        <w:t xml:space="preserve">naively, as the difference of the two readings stored in</w:t>
+      </w:r>
+      <w:r>
+        <w:t xml:space="preserve"> </w:t>
+      </w:r>
+      <w:r>
+        <w:rPr>
+          <w:rStyle w:val="VerbatimChar"/>
+        </w:rPr>
+        <w:t xml:space="preserve">int32_t</w:t>
+      </w:r>
+      <w:r>
+        <w:t xml:space="preserve"> </w:t>
+      </w:r>
+      <w:r>
+        <w:t xml:space="preserve">variables;</w:t>
+      </w:r>
+    </w:p>
+    <w:p>
+      <w:pPr>
+        <w:numPr>
+          <w:ilvl w:val="1"/>
+          <w:numId w:val="1018"/>
+        </w:numPr>
+      </w:pPr>
+      <w:r>
+        <w:t xml:space="preserve">as</w:t>
+      </w:r>
+      <w:r>
+        <w:t xml:space="preserve"> </w:t>
+      </w:r>
+      <w:r>
+        <w:rPr>
+          <w:rStyle w:val="VerbatimChar"/>
+        </w:rPr>
+        <w:t xml:space="preserve">(int16_t)(now - previous)</w:t>
+      </w:r>
+      <w:r>
+        <w:t xml:space="preserve">, with</w:t>
+      </w:r>
+      <w:r>
+        <w:t xml:space="preserve"> </w:t>
+      </w:r>
+      <w:r>
+        <w:rPr>
+          <w:rStyle w:val="VerbatimChar"/>
+        </w:rPr>
+        <w:t xml:space="preserve">now</w:t>
+      </w:r>
+      <w:r>
+        <w:t xml:space="preserve"> </w:t>
+      </w:r>
+      <w:r>
+        <w:t xml:space="preserve">and</w:t>
+      </w:r>
+      <w:r>
+        <w:t xml:space="preserve"> </w:t>
+      </w:r>
+      <w:r>
+        <w:rPr>
+          <w:rStyle w:val="VerbatimChar"/>
+        </w:rPr>
+        <w:t xml:space="preserve">previous</w:t>
+      </w:r>
+      <w:r>
+        <w:t xml:space="preserve"> </w:t>
+      </w:r>
+      <w:r>
+        <w:t xml:space="preserve">of type</w:t>
+      </w:r>
+      <w:r>
+        <w:t xml:space="preserve"> </w:t>
+      </w:r>
+      <w:r>
+        <w:rPr>
+          <w:rStyle w:val="VerbatimChar"/>
+        </w:rPr>
+        <w:t xml:space="preserve">uint16_t</w:t>
+      </w:r>
+      <w:r>
+        <w:t xml:space="preserve">.</w:t>
+      </w:r>
+    </w:p>
+    <w:p>
+      <w:pPr>
+        <w:numPr>
+          <w:ilvl w:val="0"/>
+          <w:numId w:val="1000"/>
+        </w:numPr>
+      </w:pPr>
+      <w:r>
+        <w:t xml:space="preserve">Run the wheel at constant duty, forward and then backward, long enough for the counter to wrap several times.</w:t>
+      </w:r>
+      <w:r>
+        <w:t xml:space="preserve"> </w:t>
+      </w:r>
+      <w:r>
+        <w:t xml:space="preserve">Record both speeds in rad/s and plot them against time. In your report, explain the spikes of (a), why (b)</w:t>
+      </w:r>
+      <w:r>
+        <w:t xml:space="preserve"> </w:t>
+      </w:r>
+      <w:r>
+        <w:t xml:space="preserve">gives the right answer, and the highest wheel speed (in rev/s) for which (b) still works at 100 Hz, for each</w:t>
+      </w:r>
+      <w:r>
+        <w:t xml:space="preserve"> </w:t>
+      </w:r>
+      <w:r>
+        <w:t xml:space="preserve">encoder setting of D.1. Relate it to the wrap-around of Assignment 1, Part A.</w:t>
+      </w:r>
+    </w:p>
+    <w:bookmarkEnd w:id="30"/>
+    <w:bookmarkStart w:id="31" w:name="part-e-step-response-to-matlab."/>
+    <w:p>
+      <w:pPr>
+        <w:pStyle w:val="Heading4"/>
+      </w:pPr>
+      <w:r>
+        <w:t xml:space="preserve">Part E: Step response to MATLAB.</w:t>
+      </w:r>
+    </w:p>
+    <w:p>
+      <w:pPr>
+        <w:numPr>
+          <w:ilvl w:val="0"/>
+          <w:numId w:val="1019"/>
+        </w:numPr>
+      </w:pPr>
+      <w:r>
+        <w:t xml:space="preserve">With wheel 1 at rest, step the duty from 0 to 30 % and record the speed of D.2(b) at 100 Hz for 2 s, into an</w:t>
+      </w:r>
+      <w:r>
+        <w:t xml:space="preserve"> </w:t>
+      </w:r>
+      <w:r>
+        <w:t xml:space="preserve">array inside the TIM6 interrupt. Only after the recording ends, print the array to PuTTY as two columns</w:t>
+      </w:r>
+      <w:r>
+        <w:t xml:space="preserve"> </w:t>
+      </w:r>
+      <w:r>
+        <w:t xml:space="preserve">(time in s, speed in rad/s). In your report, explain why the samples are stored first and printed afterwards,</w:t>
+      </w:r>
+      <w:r>
+        <w:t xml:space="preserve"> </w:t>
+      </w:r>
+      <w:r>
+        <w:t xml:space="preserve">and not printed inside the interrupt.</w:t>
+      </w:r>
+    </w:p>
+    <w:p>
+      <w:pPr>
+        <w:numPr>
+          <w:ilvl w:val="0"/>
+          <w:numId w:val="1019"/>
+        </w:numPr>
+      </w:pPr>
+      <w:r>
+        <w:t xml:space="preserve">Save the PuTTY output to a file (PuTTY logging), load it into MATLAB and plot it. Repeat for steps to 50 %</w:t>
+      </w:r>
+      <w:r>
+        <w:t xml:space="preserve"> </w:t>
+      </w:r>
+      <w:r>
+        <w:t xml:space="preserve">and 70 %, and plot the three responses on one figure.</w:t>
+      </w:r>
+    </w:p>
+    <w:p>
+      <w:pPr>
+        <w:numPr>
+          <w:ilvl w:val="0"/>
+          <w:numId w:val="1019"/>
+        </w:numPr>
+      </w:pPr>
+      <w:r>
+        <w:t xml:space="preserve">Fit a first-order model</w:t>
+      </w:r>
+      <w:r>
+        <w:t xml:space="preserve"> </w:t>
+      </w:r>
+      <m:oMath>
+        <m:r>
+          <m:t>ω</m:t>
+        </m:r>
+        <m:r>
+          <m:rPr>
+            <m:sty m:val="p"/>
+          </m:rPr>
+          <m:t>(</m:t>
+        </m:r>
+        <m:r>
+          <m:t>t</m:t>
+        </m:r>
+        <m:r>
+          <m:rPr>
+            <m:sty m:val="p"/>
+          </m:rPr>
+          <m:t>)</m:t>
+        </m:r>
+        <m:r>
+          <m:rPr>
+            <m:sty m:val="p"/>
+          </m:rPr>
+          <m:t>=</m:t>
+        </m:r>
+        <m:r>
+          <m:t>K</m:t>
+        </m:r>
+        <m:r>
+          <m:t> </m:t>
+        </m:r>
+        <m:r>
+          <m:t>u</m:t>
+        </m:r>
+        <m:r>
+          <m:t> </m:t>
+        </m:r>
+        <m:r>
+          <m:rPr>
+            <m:sty m:val="p"/>
+          </m:rPr>
+          <m:t>(</m:t>
+        </m:r>
+        <m:r>
+          <m:t>1</m:t>
+        </m:r>
+        <m:r>
+          <m:rPr>
+            <m:sty m:val="p"/>
+          </m:rPr>
+          <m:t>−</m:t>
+        </m:r>
+        <m:sSup>
+          <m:e>
+            <m:r>
+              <m:t>e</m:t>
+            </m:r>
+          </m:e>
+          <m:sup>
+            <m:r>
+              <m:rPr>
+                <m:sty m:val="p"/>
+              </m:rPr>
+              <m:t>−</m:t>
+            </m:r>
+            <m:r>
+              <m:t>t</m:t>
+            </m:r>
+            <m:r>
+              <m:rPr>
+                <m:sty m:val="p"/>
+              </m:rPr>
+              <m:t>/</m:t>
+            </m:r>
+            <m:r>
+              <m:t>τ</m:t>
+            </m:r>
+          </m:sup>
+        </m:sSup>
+        <m:r>
+          <m:rPr>
+            <m:sty m:val="p"/>
+          </m:rPr>
+          <m:t>)</m:t>
+        </m:r>
+      </m:oMath>
+      <w:r>
+        <w:t xml:space="preserve"> </w:t>
+      </w:r>
+      <w:r>
+        <w:t xml:space="preserve">to each response. Give</w:t>
+      </w:r>
+      <w:r>
+        <w:t xml:space="preserve"> </w:t>
+      </w:r>
+      <m:oMath>
+        <m:r>
+          <m:t>K</m:t>
+        </m:r>
+      </m:oMath>
+      <w:r>
+        <w:t xml:space="preserve"> </w:t>
+      </w:r>
+      <w:r>
+        <w:t xml:space="preserve">and</w:t>
+      </w:r>
+      <w:r>
+        <w:t xml:space="preserve"> </w:t>
+      </w:r>
+      <m:oMath>
+        <m:r>
+          <m:t>τ</m:t>
+        </m:r>
+      </m:oMath>
+      <w:r>
+        <w:t xml:space="preserve"> </w:t>
+      </w:r>
+      <w:r>
+        <w:t xml:space="preserve">for each</w:t>
+      </w:r>
+      <w:r>
+        <w:t xml:space="preserve"> </w:t>
+      </w:r>
+      <w:r>
+        <w:t xml:space="preserve">step size, and comment on whether the motor behaves linearly. Use the dead zone you found in A.4 in your</w:t>
+      </w:r>
+      <w:r>
+        <w:t xml:space="preserve"> </w:t>
+      </w:r>
+      <w:r>
+        <w:t xml:space="preserve">explanation.</w:t>
+      </w:r>
+    </w:p>
+    <w:bookmarkEnd w:id="31"/>
+    <w:bookmarkStart w:id="37" w:name="Xd24919ac9ced2faa95f0cd85bc3bcf87825091e"/>
+    <w:p>
+      <w:pPr>
+        <w:pStyle w:val="Heading3"/>
+      </w:pPr>
+      <w:r>
+        <w:t xml:space="preserve">Assignment 2: project configuration (you build</w:t>
+      </w:r>
+      <w:r>
+        <w:t xml:space="preserve"> </w:t>
+      </w:r>
+      <w:r>
+        <w:rPr>
+          <w:rStyle w:val="VerbatimChar"/>
+        </w:rPr>
+        <w:t xml:space="preserve">ass2.ioc</w:t>
+      </w:r>
+      <w:r>
+        <w:t xml:space="preserve">)</w:t>
+      </w:r>
+    </w:p>
+    <w:p>
+      <w:pPr>
+        <w:pStyle w:val="FirstParagraph"/>
+      </w:pPr>
+      <w:r>
+        <w:t xml:space="preserve">No</w:t>
+      </w:r>
+      <w:r>
+        <w:t xml:space="preserve"> </w:t>
+      </w:r>
+      <w:r>
+        <w:rPr>
+          <w:rStyle w:val="VerbatimChar"/>
+        </w:rPr>
+        <w:t xml:space="preserve">.ioc</w:t>
+      </w:r>
+      <w:r>
+        <w:t xml:space="preserve"> </w:t>
+      </w:r>
+      <w:r>
+        <w:t xml:space="preserve">file is provided for Assignment 2: you create</w:t>
+      </w:r>
+      <w:r>
+        <w:t xml:space="preserve"> </w:t>
+      </w:r>
+      <w:r>
+        <w:rPr>
+          <w:rStyle w:val="VerbatimChar"/>
+        </w:rPr>
+        <w:t xml:space="preserve">ass2.ioc</w:t>
+      </w:r>
+      <w:r>
+        <w:t xml:space="preserve"> </w:t>
+      </w:r>
+      <w:r>
+        <w:t xml:space="preserve">yourself, from</w:t>
+      </w:r>
+      <w:r>
+        <w:t xml:space="preserve"> </w:t>
+      </w:r>
+      <w:r>
+        <w:rPr>
+          <w:rStyle w:val="VerbatimChar"/>
+        </w:rPr>
+        <w:t xml:space="preserve">ass1.ioc</w:t>
+      </w:r>
+      <w:r>
+        <w:t xml:space="preserve"> </w:t>
+      </w:r>
+      <w:r>
+        <w:t xml:space="preserve">and the</w:t>
+      </w:r>
+      <w:r>
+        <w:t xml:space="preserve"> </w:t>
+      </w:r>
+      <w:r>
+        <w:t xml:space="preserve">pinout and settings in this section. It contains the complete Assignment 1 configuration, plus the wheels (motors and</w:t>
+      </w:r>
+      <w:r>
+        <w:t xml:space="preserve"> </w:t>
+      </w:r>
+      <w:r>
+        <w:t xml:space="preserve">encoders), the ultrasonic sensor and the servo that turns it. Do not start from scratch: duplicate</w:t>
+      </w:r>
+      <w:r>
+        <w:t xml:space="preserve"> </w:t>
+      </w:r>
+      <w:r>
+        <w:rPr>
+          <w:rStyle w:val="VerbatimChar"/>
+        </w:rPr>
+        <w:t xml:space="preserve">ass1.ioc</w:t>
+      </w:r>
+      <w:r>
+        <w:t xml:space="preserve"> </w:t>
+      </w:r>
+      <w:r>
+        <w:t xml:space="preserve">and add only the new items below.</w:t>
+      </w:r>
+    </w:p>
+    <w:p>
+      <w:pPr>
+        <w:numPr>
+          <w:ilvl w:val="0"/>
+          <w:numId w:val="1020"/>
+        </w:numPr>
+      </w:pPr>
+      <w:r>
+        <w:t xml:space="preserve">Open</w:t>
+      </w:r>
+      <w:r>
+        <w:t xml:space="preserve"> </w:t>
+      </w:r>
+      <w:r>
+        <w:rPr>
+          <w:rStyle w:val="VerbatimChar"/>
+        </w:rPr>
+        <w:t xml:space="preserve">ass1.ioc</w:t>
+      </w:r>
+      <w:r>
+        <w:t xml:space="preserve"> </w:t>
+      </w:r>
+      <w:r>
+        <w:t xml:space="preserve">in STM32CubeMX and save a copy with</w:t>
+      </w:r>
+      <w:r>
+        <w:t xml:space="preserve"> </w:t>
+      </w:r>
+      <w:r>
         <w:rPr>
           <w:i/>
           <w:iCs/>
         </w:rPr>
-        <w:t xml:space="preserve"> </w:t>
+        <w:t xml:space="preserve">File</w:t>
       </w:r>
       <w:r>
         <w:rPr>
           <w:i/>
           <w:iCs/>
         </w:rPr>
+        <w:t xml:space="preserve"> </w:t>
+      </w:r>
+      <m:oMath>
+        <m:r>
+          <m:rPr>
+            <m:sty m:val="p"/>
+          </m:rPr>
+          <m:t>→</m:t>
+        </m:r>
+      </m:oMath>
+      <w:r>
+        <w:rPr>
+          <w:i/>
+          <w:iCs/>
+        </w:rPr>
+        <w:t xml:space="preserve"> </w:t>
+      </w:r>
+      <w:r>
+        <w:rPr>
+          <w:i/>
+          <w:iCs/>
+        </w:rPr>
         <w:t xml:space="preserve">Save Project As</w:t>
       </w:r>
       <w:r>
@@ -5399,7 +8087,7 @@
       <w:pPr>
         <w:numPr>
           <w:ilvl w:val="0"/>
-          <w:numId w:val="1011"/>
+          <w:numId w:val="1020"/>
         </w:numPr>
       </w:pPr>
       <w:r>
@@ -5422,7 +8110,7 @@
       <w:pPr>
         <w:numPr>
           <w:ilvl w:val="0"/>
-          <w:numId w:val="1011"/>
+          <w:numId w:val="1020"/>
         </w:numPr>
       </w:pPr>
       <w:r>
@@ -5465,7 +8153,7 @@
         <w:t xml:space="preserve">All timer clocks are 170 MHz.</w:t>
       </w:r>
     </w:p>
-    <w:bookmarkStart w:id="27" w:name="pins-from-assignment-1."/>
+    <w:bookmarkStart w:id="32" w:name="pins-from-assignment-1."/>
     <w:p>
       <w:pPr>
         <w:pStyle w:val="Heading4"/>
@@ -5479,17 +8167,64 @@
         <w:pStyle w:val="FirstParagraph"/>
       </w:pPr>
       <w:r>
-        <w:t xml:space="preserve">PA5 (LD2), PC13 (B1), PA2/PA3 (LPUART1), PB8/PB9 (I2C1), PA7 (IR_SENSOR), with</w:t>
-      </w:r>
-      <w:r>
-        <w:t xml:space="preserve"> </w:t>
-      </w:r>
-      <w:r>
-        <w:t xml:space="preserve">the same settings as in Assignment 1.</w:t>
-      </w:r>
-    </w:p>
-    <w:bookmarkEnd w:id="27"/>
-    <w:bookmarkStart w:id="28" w:name="wheels-motors-and-encoders."/>
+        <w:t xml:space="preserve">PA5 (LD2), PC13 (B1), PA2/PA3 (LPUART1), PB8/PB9 (I2C1), with the same settings as</w:t>
+      </w:r>
+      <w:r>
+        <w:t xml:space="preserve"> </w:t>
+      </w:r>
+      <w:r>
+        <w:t xml:space="preserve">in Assignment 1.</w:t>
+      </w:r>
+      <w:r>
+        <w:t xml:space="preserve"> </w:t>
+      </w:r>
+      <w:r>
+        <w:rPr>
+          <w:b/>
+          <w:bCs/>
+        </w:rPr>
+        <w:t xml:space="preserve">One change:</w:t>
+      </w:r>
+      <w:r>
+        <w:t xml:space="preserve"> </w:t>
+      </w:r>
+      <w:r>
+        <w:t xml:space="preserve">PA7 (IR_SENSOR) becomes</w:t>
+      </w:r>
+      <w:r>
+        <w:t xml:space="preserve"> </w:t>
+      </w:r>
+      <w:r>
+        <w:rPr>
+          <w:b/>
+          <w:bCs/>
+        </w:rPr>
+        <w:t xml:space="preserve">GPIO_EXTI7</w:t>
+      </w:r>
+      <w:r>
+        <w:t xml:space="preserve">, trigger on rising and falling</w:t>
+      </w:r>
+      <w:r>
+        <w:t xml:space="preserve"> </w:t>
+      </w:r>
+      <w:r>
+        <w:t xml:space="preserve">edges, no pull, label kept. It can still be read with</w:t>
+      </w:r>
+      <w:r>
+        <w:t xml:space="preserve"> </w:t>
+      </w:r>
+      <w:r>
+        <w:rPr>
+          <w:rStyle w:val="VerbatimChar"/>
+        </w:rPr>
+        <w:t xml:space="preserve">HAL_GPIO_ReadPin</w:t>
+      </w:r>
+      <w:r>
+        <w:t xml:space="preserve">.</w:t>
+      </w:r>
+    </w:p>
+    <w:bookmarkEnd w:id="32"/>
+    <w:bookmarkStart w:id="33" w:name="wheels-motors-and-encoders."/>
     <w:p>
       <w:pPr>
         <w:pStyle w:val="Heading4"/>
@@ -5889,8 +8624,8 @@
         <w:t xml:space="preserve">for motors 1 and 4 and RESET for motors 2 and 3, because the motors on the two sides of the cart are mirrored.</w:t>
       </w:r>
     </w:p>
-    <w:bookmarkEnd w:id="28"/>
-    <w:bookmarkStart w:id="29" w:name="ultrasonic-sensor-hc-sr04."/>
+    <w:bookmarkEnd w:id="33"/>
+    <w:bookmarkStart w:id="34" w:name="ultrasonic-sensor-hc-sr04."/>
     <w:p>
       <w:pPr>
         <w:pStyle w:val="Heading4"/>
@@ -6180,9 +8915,27 @@
       <w:r>
         <w:t xml:space="preserve">.</w:t>
       </w:r>
-    </w:p>
-    <w:bookmarkEnd w:id="29"/>
-    <w:bookmarkStart w:id="30" w:name="peripherals.-1"/>
+      <w:r>
+        <w:br/>
+      </w:r>
+      <w:r>
+        <w:t xml:space="preserve">The trigger pulses start only after</w:t>
+      </w:r>
+      <w:r>
+        <w:t xml:space="preserve"> </w:t>
+      </w:r>
+      <w:r>
+        <w:rPr>
+          <w:rStyle w:val="VerbatimChar"/>
+        </w:rPr>
+        <w:t xml:space="preserve">HAL_TIM_PWM_Start(&amp;htim5, TIM_CHANNEL_1)</w:t>
+      </w:r>
+      <w:r>
+        <w:t xml:space="preserve">.</w:t>
+      </w:r>
+    </w:p>
+    <w:bookmarkEnd w:id="34"/>
+    <w:bookmarkStart w:id="35" w:name="peripherals.-1"/>
     <w:p>
       <w:pPr>
         <w:pStyle w:val="Heading4"/>
@@ -6494,6 +9247,94 @@
               <w:jc w:val="left"/>
             </w:pPr>
             <w:r>
+              <w:t xml:space="preserve">TIM7</w:t>
+            </w:r>
+          </w:p>
+        </w:tc>
+        <w:tc>
+          <w:tcPr/>
+          <w:p>
+            <w:pPr>
+              <w:pStyle w:val="Compact"/>
+              <w:jc w:val="left"/>
+            </w:pPr>
+            <w:r>
+              <w:t xml:space="preserve">Activated (basic timer)</w:t>
+            </w:r>
+          </w:p>
+        </w:tc>
+        <w:tc>
+          <w:tcPr/>
+          <w:p>
+            <w:pPr>
+              <w:pStyle w:val="Compact"/>
+              <w:jc w:val="left"/>
+            </w:pPr>
+            <w:r>
+              <w:t xml:space="preserve">Prescaler 169, period 99: 1 MHz tick, update interrupt at 10 kHz (the</w:t>
+            </w:r>
+            <w:r>
+              <w:t xml:space="preserve"> </w:t>
+            </w:r>
+            <w:r>
+              <w:t xml:space="preserve">software PWM of A.2)</w:t>
+            </w:r>
+          </w:p>
+        </w:tc>
+      </w:tr>
+      <w:tr>
+        <w:tc>
+          <w:tcPr/>
+          <w:p>
+            <w:pPr>
+              <w:pStyle w:val="Compact"/>
+              <w:jc w:val="left"/>
+            </w:pPr>
+            <w:r>
+              <w:t xml:space="preserve">TIM6</w:t>
+            </w:r>
+          </w:p>
+        </w:tc>
+        <w:tc>
+          <w:tcPr/>
+          <w:p>
+            <w:pPr>
+              <w:pStyle w:val="Compact"/>
+              <w:jc w:val="left"/>
+            </w:pPr>
+            <w:r>
+              <w:t xml:space="preserve">Activated (basic timer)</w:t>
+            </w:r>
+          </w:p>
+        </w:tc>
+        <w:tc>
+          <w:tcPr/>
+          <w:p>
+            <w:pPr>
+              <w:pStyle w:val="Compact"/>
+              <w:jc w:val="left"/>
+            </w:pPr>
+            <w:r>
+              <w:t xml:space="preserve">Prescaler 169, period 9 999: 1 MHz tick, update interrupt at 100 Hz (the sample</w:t>
+            </w:r>
+            <w:r>
+              <w:t xml:space="preserve"> </w:t>
+            </w:r>
+            <w:r>
+              <w:t xml:space="preserve">rate of Parts D and E)</w:t>
+            </w:r>
+          </w:p>
+        </w:tc>
+      </w:tr>
+      <w:tr>
+        <w:tc>
+          <w:tcPr/>
+          <w:p>
+            <w:pPr>
+              <w:pStyle w:val="Compact"/>
+              <w:jc w:val="left"/>
+            </w:pPr>
+            <w:r>
               <w:t xml:space="preserve">NVIC</w:t>
             </w:r>
           </w:p>
@@ -6514,14 +9355,20 @@
               <w:jc w:val="left"/>
             </w:pPr>
             <w:r>
-              <w:t xml:space="preserve">EXTI line [15:10] (B1), TIM2 and TIM5 global interrupts enabled</w:t>
+              <w:t xml:space="preserve">EXTI line [9:5] (IR sensor), EXTI line [15:10] (B1), TIM2, TIM5, TIM6 (TIM6_DAC) and TIM7 (TIM7_DAC) global interrupts</w:t>
+            </w:r>
+            <w:r>
+              <w:t xml:space="preserve"> </w:t>
+            </w:r>
+            <w:r>
+              <w:t xml:space="preserve">enabled</w:t>
             </w:r>
           </w:p>
         </w:tc>
       </w:tr>
     </w:tbl>
-    <w:bookmarkEnd w:id="30"/>
-    <w:bookmarkStart w:id="31" w:name="devices-on-the-i2c-bus."/>
+    <w:bookmarkEnd w:id="35"/>
+    <w:bookmarkStart w:id="36" w:name="devices-on-the-i2c-bus."/>
     <w:p>
       <w:pPr>
         <w:pStyle w:val="Heading4"/>
@@ -6677,10 +9524,10 @@
         </w:tc>
       </w:tr>
     </w:tbl>
-    <w:bookmarkEnd w:id="31"/>
-    <w:bookmarkEnd w:id="32"/>
-    <w:bookmarkEnd w:id="33"/>
-    <w:bookmarkStart w:id="34" w:name="assignment-3-wheels-on-the-ground"/>
+    <w:bookmarkEnd w:id="36"/>
+    <w:bookmarkEnd w:id="37"/>
+    <w:bookmarkEnd w:id="38"/>
+    <w:bookmarkStart w:id="42" w:name="assignment-3-wheels-on-the-ground"/>
     <w:p>
       <w:pPr>
         <w:pStyle w:val="Heading2"/>
@@ -6700,11 +9547,545 @@
         <w:pStyle w:val="FirstParagraph"/>
       </w:pPr>
       <w:r>
-        <w:t xml:space="preserve">To be defined.</w:t>
-      </w:r>
-    </w:p>
-    <w:bookmarkEnd w:id="34"/>
-    <w:bookmarkStart w:id="35" w:name="quizzes"/>
+        <w:rPr>
+          <w:b/>
+          <w:bCs/>
+        </w:rPr>
+        <w:t xml:space="preserve">Window:</w:t>
+      </w:r>
+      <w:r>
+        <w:t xml:space="preserve"> </w:t>
+      </w:r>
+      <w:r>
+        <w:t xml:space="preserve">out at session 11, due on 3.3.2027. The assignment may use everything taught up to and including</w:t>
+      </w:r>
+      <w:r>
+        <w:t xml:space="preserve"> </w:t>
+      </w:r>
+      <w:r>
+        <w:t xml:space="preserve">session 12.</w:t>
+      </w:r>
+      <w:r>
+        <w:t xml:space="preserve"> </w:t>
+      </w:r>
+      <w:r>
+        <w:rPr>
+          <w:b/>
+          <w:bCs/>
+        </w:rPr>
+        <w:t xml:space="preserve">Hardware:</w:t>
+      </w:r>
+      <w:r>
+        <w:t xml:space="preserve"> </w:t>
+      </w:r>
+      <w:r>
+        <w:t xml:space="preserve">the cart</w:t>
+      </w:r>
+      <w:r>
+        <w:t xml:space="preserve"> </w:t>
+      </w:r>
+      <w:r>
+        <w:rPr>
+          <w:b/>
+          <w:bCs/>
+        </w:rPr>
+        <w:t xml:space="preserve">on the floor</w:t>
+      </w:r>
+      <w:r>
+        <w:t xml:space="preserve">, battery and motor power on, the IR sensor, the ultrasonic sensor on</w:t>
+      </w:r>
+      <w:r>
+        <w:t xml:space="preserve"> </w:t>
+      </w:r>
+      <w:r>
+        <w:t xml:space="preserve">its servo, and three obstacles.</w:t>
+      </w:r>
+      <w:r>
+        <w:t xml:space="preserve"> </w:t>
+      </w:r>
+      <w:r>
+        <w:rPr>
+          <w:b/>
+          <w:bCs/>
+        </w:rPr>
+        <w:t xml:space="preserve">Project:</w:t>
+      </w:r>
+      <w:r>
+        <w:t xml:space="preserve"> </w:t>
+      </w:r>
+      <w:r>
+        <w:rPr>
+          <w:rStyle w:val="VerbatimChar"/>
+        </w:rPr>
+        <w:t xml:space="preserve">ass3.ioc</w:t>
+      </w:r>
+      <w:r>
+        <w:t xml:space="preserve">, a copy of your</w:t>
+      </w:r>
+      <w:r>
+        <w:t xml:space="preserve"> </w:t>
+      </w:r>
+      <w:r>
+        <w:rPr>
+          <w:rStyle w:val="VerbatimChar"/>
+        </w:rPr>
+        <w:t xml:space="preserve">ass2.ioc</w:t>
+      </w:r>
+      <w:r>
+        <w:t xml:space="preserve"> </w:t>
+      </w:r>
+      <w:r>
+        <w:t xml:space="preserve">(</w:t>
+      </w:r>
+      <w:r>
+        <w:rPr>
+          <w:i/>
+          <w:iCs/>
+        </w:rPr>
+        <w:t xml:space="preserve">File</w:t>
+      </w:r>
+      <w:r>
+        <w:rPr>
+          <w:i/>
+          <w:iCs/>
+        </w:rPr>
+        <w:t xml:space="preserve"> </w:t>
+      </w:r>
+      <m:oMath>
+        <m:r>
+          <m:rPr>
+            <m:sty m:val="p"/>
+          </m:rPr>
+          <m:t>→</m:t>
+        </m:r>
+      </m:oMath>
+      <w:r>
+        <w:rPr>
+          <w:i/>
+          <w:iCs/>
+        </w:rPr>
+        <w:t xml:space="preserve"> </w:t>
+      </w:r>
+      <w:r>
+        <w:rPr>
+          <w:i/>
+          <w:iCs/>
+        </w:rPr>
+        <w:t xml:space="preserve">Save Project As</w:t>
+      </w:r>
+      <w:r>
+        <w:t xml:space="preserve">, as in</w:t>
+      </w:r>
+      <w:r>
+        <w:t xml:space="preserve"> </w:t>
+      </w:r>
+      <w:r>
+        <w:t xml:space="preserve">Assignment 2). No new pins or peripherals are needed.</w:t>
+      </w:r>
+      <w:r>
+        <w:t xml:space="preserve"> </w:t>
+      </w:r>
+      <w:r>
+        <w:rPr>
+          <w:rStyle w:val="Colorred"/>
+        </w:rPr>
+        <w:t xml:space="preserve">[Bucher and Yohai: the obstacles (size, material that the ultrasonic sensor sees well, spacing along the path),</w:t>
+      </w:r>
+      <w:r>
+        <w:rPr>
+          <w:rStyle w:val="Colorred"/>
+        </w:rPr>
+        <w:t xml:space="preserve"> </w:t>
+      </w:r>
+      <w:r>
+        <w:rPr>
+          <w:rStyle w:val="Colorred"/>
+        </w:rPr>
+        <w:t xml:space="preserve">the length of the course and the floor area in Room 26.]</w:t>
+      </w:r>
+    </w:p>
+    <w:p>
+      <w:pPr>
+        <w:pStyle w:val="BodyText"/>
+      </w:pPr>
+      <w:r>
+        <w:rPr>
+          <w:b/>
+          <w:bCs/>
+        </w:rPr>
+        <w:t xml:space="preserve">Learning outcome.</w:t>
+      </w:r>
+      <w:r>
+        <w:t xml:space="preserve"> </w:t>
+      </w:r>
+      <w:r>
+        <w:t xml:space="preserve">Students design a PI speed controller from their own plant model and run it on the</w:t>
+      </w:r>
+      <w:r>
+        <w:t xml:space="preserve"> </w:t>
+      </w:r>
+      <w:r>
+        <w:t xml:space="preserve">cart; they drive the cart in straight lines from the wheel kinematics; they combine two sensors with different strengths</w:t>
+      </w:r>
+      <w:r>
+        <w:t xml:space="preserve"> </w:t>
+      </w:r>
+      <w:r>
+        <w:t xml:space="preserve">into one decision and justify the strategy; they structure a driving task as a state machine.</w:t>
+      </w:r>
+    </w:p>
+    <w:p>
+      <w:pPr>
+        <w:pStyle w:val="BodyText"/>
+      </w:pPr>
+      <w:r>
+        <w:rPr>
+          <w:b/>
+          <w:bCs/>
+        </w:rPr>
+        <w:t xml:space="preserve">Safety.</w:t>
+      </w:r>
+      <w:r>
+        <w:t xml:space="preserve"> </w:t>
+      </w:r>
+      <w:r>
+        <w:t xml:space="preserve">Test at low speed first. B1 must stop all four wheels at any moment, in every state of your program.</w:t>
+      </w:r>
+      <w:r>
+        <w:t xml:space="preserve"> </w:t>
+      </w:r>
+      <w:r>
+        <w:t xml:space="preserve">Keep the cart inside the test area and catch it if it drives towards people or furniture.</w:t>
+      </w:r>
+    </w:p>
+    <w:bookmarkStart w:id="39" w:name="part-a-pi-speed-controller."/>
+    <w:p>
+      <w:pPr>
+        <w:pStyle w:val="Heading4"/>
+      </w:pPr>
+      <w:r>
+        <w:t xml:space="preserve">Part A: PI speed controller.</w:t>
+      </w:r>
+    </w:p>
+    <w:p>
+      <w:pPr>
+        <w:numPr>
+          <w:ilvl w:val="0"/>
+          <w:numId w:val="1021"/>
+        </w:numPr>
+      </w:pPr>
+      <w:r>
+        <w:t xml:space="preserve">Start from the first-order model you fitted in Assignment 2, Part E (</w:t>
+      </w:r>
+      <m:oMath>
+        <m:r>
+          <m:t>K</m:t>
+        </m:r>
+      </m:oMath>
+      <w:r>
+        <w:t xml:space="preserve">,</w:t>
+      </w:r>
+      <w:r>
+        <w:t xml:space="preserve"> </w:t>
+      </w:r>
+      <m:oMath>
+        <m:r>
+          <m:t>τ</m:t>
+        </m:r>
+      </m:oMath>
+      <w:r>
+        <w:t xml:space="preserve">). Choose a requirement for</w:t>
+      </w:r>
+      <w:r>
+        <w:t xml:space="preserve"> </w:t>
+      </w:r>
+      <w:r>
+        <w:t xml:space="preserve">the closed loop (for example a settling time and the largest overshoot you accept), design a PI controller for</w:t>
+      </w:r>
+      <w:r>
+        <w:t xml:space="preserve"> </w:t>
+      </w:r>
+      <w:r>
+        <w:t xml:space="preserve">the wheel speed that meets it, and give</w:t>
+      </w:r>
+      <w:r>
+        <w:t xml:space="preserve"> </w:t>
+      </w:r>
+      <m:oMath>
+        <m:sSub>
+          <m:e>
+            <m:r>
+              <m:t>K</m:t>
+            </m:r>
+          </m:e>
+          <m:sub>
+            <m:r>
+              <m:t>p</m:t>
+            </m:r>
+          </m:sub>
+        </m:sSub>
+      </m:oMath>
+      <w:r>
+        <w:t xml:space="preserve"> </w:t>
+      </w:r>
+      <w:r>
+        <w:t xml:space="preserve">and</w:t>
+      </w:r>
+      <w:r>
+        <w:t xml:space="preserve"> </w:t>
+      </w:r>
+      <m:oMath>
+        <m:sSub>
+          <m:e>
+            <m:r>
+              <m:t>K</m:t>
+            </m:r>
+          </m:e>
+          <m:sub>
+            <m:r>
+              <m:t>i</m:t>
+            </m:r>
+          </m:sub>
+        </m:sSub>
+      </m:oMath>
+      <w:r>
+        <w:t xml:space="preserve">. Explain your choice.</w:t>
+      </w:r>
+    </w:p>
+    <w:p>
+      <w:pPr>
+        <w:numPr>
+          <w:ilvl w:val="0"/>
+          <w:numId w:val="1021"/>
+        </w:numPr>
+      </w:pPr>
+      <w:r>
+        <w:t xml:space="preserve">Discretise the controller for the 100 Hz interrupt of TIM6 and implement it in C, for all four wheels. Limit</w:t>
+      </w:r>
+      <w:r>
+        <w:t xml:space="preserve"> </w:t>
+      </w:r>
+      <w:r>
+        <w:t xml:space="preserve">the duty to its allowed range, and prevent integrator windup while the duty is saturated.</w:t>
+      </w:r>
+    </w:p>
+    <w:p>
+      <w:pPr>
+        <w:numPr>
+          <w:ilvl w:val="0"/>
+          <w:numId w:val="1021"/>
+        </w:numPr>
+      </w:pPr>
+      <w:r>
+        <w:t xml:space="preserve">With the wheels in the air, step the speed setpoint of wheel 1 and record the response as in Assignment 2,</w:t>
+      </w:r>
+      <w:r>
+        <w:t xml:space="preserve"> </w:t>
+      </w:r>
+      <w:r>
+        <w:t xml:space="preserve">Part E. In MATLAB, plot the measured and the simulated closed-loop responses on one figure, and explain the</w:t>
+      </w:r>
+      <w:r>
+        <w:t xml:space="preserve"> </w:t>
+      </w:r>
+      <w:r>
+        <w:t xml:space="preserve">differences.</w:t>
+      </w:r>
+    </w:p>
+    <w:p>
+      <w:pPr>
+        <w:numPr>
+          <w:ilvl w:val="0"/>
+          <w:numId w:val="1021"/>
+        </w:numPr>
+      </w:pPr>
+      <w:r>
+        <w:t xml:space="preserve">Repeat A.3 with the cart on the floor, all four wheels at the same setpoint. What changes, and why?</w:t>
+      </w:r>
+    </w:p>
+    <w:bookmarkEnd w:id="39"/>
+    <w:bookmarkStart w:id="40" w:name="part-b-obstacle-course."/>
+    <w:p>
+      <w:pPr>
+        <w:pStyle w:val="Heading4"/>
+      </w:pPr>
+      <w:r>
+        <w:t xml:space="preserve">Part B: Obstacle course.</w:t>
+      </w:r>
+    </w:p>
+    <w:p>
+      <w:pPr>
+        <w:pStyle w:val="FirstParagraph"/>
+      </w:pPr>
+      <w:r>
+        <w:t xml:space="preserve">The cart drives forward along a straight line under the speed control of Part A. When it detects an obstacle ahead, it</w:t>
+      </w:r>
+      <w:r>
+        <w:t xml:space="preserve"> </w:t>
+      </w:r>
+      <w:r>
+        <w:t xml:space="preserve">gets as close to it as it can without touching it, and stops. It bypasses the first obstacle from the right, as close</w:t>
+      </w:r>
+      <w:r>
+        <w:t xml:space="preserve"> </w:t>
+      </w:r>
+      <w:r>
+        <w:t xml:space="preserve">to the obstacle as it can, and comes back to the original line. It bypasses the next obstacle from the left, and the</w:t>
+      </w:r>
+      <w:r>
+        <w:t xml:space="preserve"> </w:t>
+      </w:r>
+      <w:r>
+        <w:t xml:space="preserve">third from the right again, each time returning to the original line and driving on.</w:t>
+      </w:r>
+    </w:p>
+    <w:p>
+      <w:pPr>
+        <w:numPr>
+          <w:ilvl w:val="0"/>
+          <w:numId w:val="1022"/>
+        </w:numPr>
+      </w:pPr>
+      <w:r>
+        <w:t xml:space="preserve">Use</w:t>
+      </w:r>
+      <w:r>
+        <w:t xml:space="preserve"> </w:t>
+      </w:r>
+      <w:r>
+        <w:rPr>
+          <w:b/>
+          <w:bCs/>
+        </w:rPr>
+        <w:t xml:space="preserve">both</w:t>
+      </w:r>
+      <w:r>
+        <w:t xml:space="preserve"> </w:t>
+      </w:r>
+      <w:r>
+        <w:t xml:space="preserve">sensors, the IR sensor and the ultrasonic sensor. Explain your strategy in the report: which</w:t>
+      </w:r>
+      <w:r>
+        <w:t xml:space="preserve"> </w:t>
+      </w:r>
+      <w:r>
+        <w:t xml:space="preserve">sensor detects the obstacle, which one decides how close you get, what you do when they disagree, and how you</w:t>
+      </w:r>
+      <w:r>
+        <w:t xml:space="preserve"> </w:t>
+      </w:r>
+      <w:r>
+        <w:t xml:space="preserve">handle false or missing readings. Support it with measurements of each sensor’s range and reliability.</w:t>
+      </w:r>
+    </w:p>
+    <w:p>
+      <w:pPr>
+        <w:numPr>
+          <w:ilvl w:val="0"/>
+          <w:numId w:val="1022"/>
+        </w:numPr>
+      </w:pPr>
+      <w:r>
+        <w:t xml:space="preserve">Write the program as a state machine (</w:t>
+      </w:r>
+      <w:r>
+        <w:rPr>
+          <w:rStyle w:val="VerbatimChar"/>
+        </w:rPr>
+        <w:t xml:space="preserve">enum</w:t>
+      </w:r>
+      <w:r>
+        <w:t xml:space="preserve"> </w:t>
+      </w:r>
+      <w:r>
+        <w:t xml:space="preserve">+</w:t>
+      </w:r>
+      <w:r>
+        <w:t xml:space="preserve"> </w:t>
+      </w:r>
+      <w:r>
+        <w:rPr>
+          <w:rStyle w:val="VerbatimChar"/>
+        </w:rPr>
+        <w:t xml:space="preserve">switch</w:t>
+      </w:r>
+      <w:r>
+        <w:t xml:space="preserve">). Include the state diagram in the</w:t>
+      </w:r>
+      <w:r>
+        <w:t xml:space="preserve"> </w:t>
+      </w:r>
+      <w:r>
+        <w:t xml:space="preserve">report, with the condition for every transition.</w:t>
+      </w:r>
+    </w:p>
+    <w:p>
+      <w:pPr>
+        <w:numPr>
+          <w:ilvl w:val="0"/>
+          <w:numId w:val="1022"/>
+        </w:numPr>
+      </w:pPr>
+      <w:r>
+        <w:t xml:space="preserve">Use the encoders to measure how far the cart has moved. In the report, give the closest distance to each</w:t>
+      </w:r>
+      <w:r>
+        <w:t xml:space="preserve"> </w:t>
+      </w:r>
+      <w:r>
+        <w:t xml:space="preserve">obstacle and the sideways distance from the original line after each bypass.</w:t>
+      </w:r>
+    </w:p>
+    <w:p>
+      <w:pPr>
+        <w:pStyle w:val="FirstParagraph"/>
+      </w:pPr>
+      <w:r>
+        <w:t xml:space="preserve">Show the whole course, all three obstacles, in the video.</w:t>
+      </w:r>
+    </w:p>
+    <w:bookmarkEnd w:id="40"/>
+    <w:bookmarkStart w:id="41" w:name="part-c-bonus-back-to-the-start."/>
+    <w:p>
+      <w:pPr>
+        <w:pStyle w:val="Heading4"/>
+      </w:pPr>
+      <w:r>
+        <w:t xml:space="preserve">Part C (bonus): Back to the start.</w:t>
+      </w:r>
+    </w:p>
+    <w:p>
+      <w:pPr>
+        <w:pStyle w:val="FirstParagraph"/>
+      </w:pPr>
+      <w:r>
+        <w:t xml:space="preserve">After the third obstacle, the cart returns to its starting point. Learn by yourself how to pivot the cart (turn it in</w:t>
+      </w:r>
+      <w:r>
+        <w:t xml:space="preserve"> </w:t>
+      </w:r>
+      <w:r>
+        <w:t xml:space="preserve">place), and then drive back in straight lines. Report how far from the starting point the cart stopped, and explain</w:t>
+      </w:r>
+      <w:r>
+        <w:t xml:space="preserve"> </w:t>
+      </w:r>
+      <w:r>
+        <w:t xml:space="preserve">where the error comes from.</w:t>
+      </w:r>
+      <w:r>
+        <w:t xml:space="preserve"> </w:t>
+      </w:r>
+      <w:r>
+        <w:rPr>
+          <w:rStyle w:val="Colorred"/>
+        </w:rPr>
+        <w:t xml:space="preserve">[Bucher and Yohai: the weight of the bonus, and whether the obstacles stay on the course for the way back.]</w:t>
+      </w:r>
+    </w:p>
+    <w:bookmarkEnd w:id="41"/>
+    <w:bookmarkEnd w:id="42"/>
+    <w:bookmarkStart w:id="43" w:name="quizzes"/>
     <w:p>
       <w:pPr>
         <w:pStyle w:val="Heading2"/>
@@ -6718,11 +10099,11 @@
         <w:pStyle w:val="FirstParagraph"/>
       </w:pPr>
       <w:r>
-        <w:t xml:space="preserve">Two quizzes, each 10% of the final grade, held in the first hour of the lecture: Quiz 1 in session 4 (23.11.2026), Quiz 2 in session 8 (21.12.2026).</w:t>
-      </w:r>
-    </w:p>
-    <w:bookmarkEnd w:id="35"/>
-    <w:bookmarkEnd w:id="36"/>
+        <w:t xml:space="preserve">Two quizzes, each 10% of the final grade, held in the first hour of the lecture: Quiz 1 in session 4 (23.11.2026), Quiz 2 in session 9 (28.12.2026).</w:t>
+      </w:r>
+    </w:p>
+    <w:bookmarkEnd w:id="43"/>
+    <w:bookmarkEnd w:id="44"/>
     <w:sectPr>
       <w:footnotePr>
         <w:numRestart w:val="eachSect"/>
@@ -7244,6 +10625,336 @@
     </w:lvlOverride>
   </w:num>
   <w:num w:numId="1011">
+    <w:abstractNumId w:val="99201"/>
+    <w:lvlOverride w:ilvl="0">
+      <w:startOverride w:val="1"/>
+    </w:lvlOverride>
+    <w:lvlOverride w:ilvl="1">
+      <w:startOverride w:val="1"/>
+    </w:lvlOverride>
+    <w:lvlOverride w:ilvl="2">
+      <w:startOverride w:val="1"/>
+    </w:lvlOverride>
+    <w:lvlOverride w:ilvl="3">
+      <w:startOverride w:val="1"/>
+    </w:lvlOverride>
+    <w:lvlOverride w:ilvl="4">
+      <w:startOverride w:val="1"/>
+    </w:lvlOverride>
+    <w:lvlOverride w:ilvl="5">
+      <w:startOverride w:val="1"/>
+    </w:lvlOverride>
+    <w:lvlOverride w:ilvl="6">
+      <w:startOverride w:val="1"/>
+    </w:lvlOverride>
+    <w:lvlOverride w:ilvl="7">
+      <w:startOverride w:val="1"/>
+    </w:lvlOverride>
+    <w:lvlOverride w:ilvl="8">
+      <w:startOverride w:val="1"/>
+    </w:lvlOverride>
+  </w:num>
+  <w:num w:numId="1012">
+    <w:abstractNumId w:val="99201"/>
+    <w:lvlOverride w:ilvl="0">
+      <w:startOverride w:val="1"/>
+    </w:lvlOverride>
+    <w:lvlOverride w:ilvl="1">
+      <w:startOverride w:val="1"/>
+    </w:lvlOverride>
+    <w:lvlOverride w:ilvl="2">
+      <w:startOverride w:val="1"/>
+    </w:lvlOverride>
+    <w:lvlOverride w:ilvl="3">
+      <w:startOverride w:val="1"/>
+    </w:lvlOverride>
+    <w:lvlOverride w:ilvl="4">
+      <w:startOverride w:val="1"/>
+    </w:lvlOverride>
+    <w:lvlOverride w:ilvl="5">
+      <w:startOverride w:val="1"/>
+    </w:lvlOverride>
+    <w:lvlOverride w:ilvl="6">
+      <w:startOverride w:val="1"/>
+    </w:lvlOverride>
+    <w:lvlOverride w:ilvl="7">
+      <w:startOverride w:val="1"/>
+    </w:lvlOverride>
+    <w:lvlOverride w:ilvl="8">
+      <w:startOverride w:val="1"/>
+    </w:lvlOverride>
+  </w:num>
+  <w:num w:numId="1013">
+    <w:abstractNumId w:val="99201"/>
+    <w:lvlOverride w:ilvl="0">
+      <w:startOverride w:val="1"/>
+    </w:lvlOverride>
+    <w:lvlOverride w:ilvl="1">
+      <w:startOverride w:val="1"/>
+    </w:lvlOverride>
+    <w:lvlOverride w:ilvl="2">
+      <w:startOverride w:val="1"/>
+    </w:lvlOverride>
+    <w:lvlOverride w:ilvl="3">
+      <w:startOverride w:val="1"/>
+    </w:lvlOverride>
+    <w:lvlOverride w:ilvl="4">
+      <w:startOverride w:val="1"/>
+    </w:lvlOverride>
+    <w:lvlOverride w:ilvl="5">
+      <w:startOverride w:val="1"/>
+    </w:lvlOverride>
+    <w:lvlOverride w:ilvl="6">
+      <w:startOverride w:val="1"/>
+    </w:lvlOverride>
+    <w:lvlOverride w:ilvl="7">
+      <w:startOverride w:val="1"/>
+    </w:lvlOverride>
+    <w:lvlOverride w:ilvl="8">
+      <w:startOverride w:val="1"/>
+    </w:lvlOverride>
+  </w:num>
+  <w:num w:numId="1014">
+    <w:abstractNumId w:val="99201"/>
+    <w:lvlOverride w:ilvl="0">
+      <w:startOverride w:val="1"/>
+    </w:lvlOverride>
+    <w:lvlOverride w:ilvl="1">
+      <w:startOverride w:val="1"/>
+    </w:lvlOverride>
+    <w:lvlOverride w:ilvl="2">
+      <w:startOverride w:val="1"/>
+    </w:lvlOverride>
+    <w:lvlOverride w:ilvl="3">
+      <w:startOverride w:val="1"/>
+    </w:lvlOverride>
+    <w:lvlOverride w:ilvl="4">
+      <w:startOverride w:val="1"/>
+    </w:lvlOverride>
+    <w:lvlOverride w:ilvl="5">
+      <w:startOverride w:val="1"/>
+    </w:lvlOverride>
+    <w:lvlOverride w:ilvl="6">
+      <w:startOverride w:val="1"/>
+    </w:lvlOverride>
+    <w:lvlOverride w:ilvl="7">
+      <w:startOverride w:val="1"/>
+    </w:lvlOverride>
+    <w:lvlOverride w:ilvl="8">
+      <w:startOverride w:val="1"/>
+    </w:lvlOverride>
+  </w:num>
+  <w:num w:numId="1015">
+    <w:abstractNumId w:val="99201"/>
+    <w:lvlOverride w:ilvl="0">
+      <w:startOverride w:val="1"/>
+    </w:lvlOverride>
+    <w:lvlOverride w:ilvl="1">
+      <w:startOverride w:val="1"/>
+    </w:lvlOverride>
+    <w:lvlOverride w:ilvl="2">
+      <w:startOverride w:val="1"/>
+    </w:lvlOverride>
+    <w:lvlOverride w:ilvl="3">
+      <w:startOverride w:val="1"/>
+    </w:lvlOverride>
+    <w:lvlOverride w:ilvl="4">
+      <w:startOverride w:val="1"/>
+    </w:lvlOverride>
+    <w:lvlOverride w:ilvl="5">
+      <w:startOverride w:val="1"/>
+    </w:lvlOverride>
+    <w:lvlOverride w:ilvl="6">
+      <w:startOverride w:val="1"/>
+    </w:lvlOverride>
+    <w:lvlOverride w:ilvl="7">
+      <w:startOverride w:val="1"/>
+    </w:lvlOverride>
+    <w:lvlOverride w:ilvl="8">
+      <w:startOverride w:val="1"/>
+    </w:lvlOverride>
+  </w:num>
+  <w:num w:numId="1016">
+    <w:abstractNumId w:val="99201"/>
+    <w:lvlOverride w:ilvl="0">
+      <w:startOverride w:val="1"/>
+    </w:lvlOverride>
+    <w:lvlOverride w:ilvl="1">
+      <w:startOverride w:val="1"/>
+    </w:lvlOverride>
+    <w:lvlOverride w:ilvl="2">
+      <w:startOverride w:val="1"/>
+    </w:lvlOverride>
+    <w:lvlOverride w:ilvl="3">
+      <w:startOverride w:val="1"/>
+    </w:lvlOverride>
+    <w:lvlOverride w:ilvl="4">
+      <w:startOverride w:val="1"/>
+    </w:lvlOverride>
+    <w:lvlOverride w:ilvl="5">
+      <w:startOverride w:val="1"/>
+    </w:lvlOverride>
+    <w:lvlOverride w:ilvl="6">
+      <w:startOverride w:val="1"/>
+    </w:lvlOverride>
+    <w:lvlOverride w:ilvl="7">
+      <w:startOverride w:val="1"/>
+    </w:lvlOverride>
+    <w:lvlOverride w:ilvl="8">
+      <w:startOverride w:val="1"/>
+    </w:lvlOverride>
+  </w:num>
+  <w:num w:numId="1017">
+    <w:abstractNumId w:val="99201"/>
+    <w:lvlOverride w:ilvl="0">
+      <w:startOverride w:val="1"/>
+    </w:lvlOverride>
+    <w:lvlOverride w:ilvl="1">
+      <w:startOverride w:val="1"/>
+    </w:lvlOverride>
+    <w:lvlOverride w:ilvl="2">
+      <w:startOverride w:val="1"/>
+    </w:lvlOverride>
+    <w:lvlOverride w:ilvl="3">
+      <w:startOverride w:val="1"/>
+    </w:lvlOverride>
+    <w:lvlOverride w:ilvl="4">
+      <w:startOverride w:val="1"/>
+    </w:lvlOverride>
+    <w:lvlOverride w:ilvl="5">
+      <w:startOverride w:val="1"/>
+    </w:lvlOverride>
+    <w:lvlOverride w:ilvl="6">
+      <w:startOverride w:val="1"/>
+    </w:lvlOverride>
+    <w:lvlOverride w:ilvl="7">
+      <w:startOverride w:val="1"/>
+    </w:lvlOverride>
+    <w:lvlOverride w:ilvl="8">
+      <w:startOverride w:val="1"/>
+    </w:lvlOverride>
+  </w:num>
+  <w:num w:numId="1018">
+    <w:abstractNumId w:val="99201"/>
+    <w:lvlOverride w:ilvl="0">
+      <w:startOverride w:val="1"/>
+    </w:lvlOverride>
+    <w:lvlOverride w:ilvl="1">
+      <w:startOverride w:val="1"/>
+    </w:lvlOverride>
+    <w:lvlOverride w:ilvl="2">
+      <w:startOverride w:val="1"/>
+    </w:lvlOverride>
+    <w:lvlOverride w:ilvl="3">
+      <w:startOverride w:val="1"/>
+    </w:lvlOverride>
+    <w:lvlOverride w:ilvl="4">
+      <w:startOverride w:val="1"/>
+    </w:lvlOverride>
+    <w:lvlOverride w:ilvl="5">
+      <w:startOverride w:val="1"/>
+    </w:lvlOverride>
+    <w:lvlOverride w:ilvl="6">
+      <w:startOverride w:val="1"/>
+    </w:lvlOverride>
+    <w:lvlOverride w:ilvl="7">
+      <w:startOverride w:val="1"/>
+    </w:lvlOverride>
+    <w:lvlOverride w:ilvl="8">
+      <w:startOverride w:val="1"/>
+    </w:lvlOverride>
+  </w:num>
+  <w:num w:numId="1019">
+    <w:abstractNumId w:val="99201"/>
+    <w:lvlOverride w:ilvl="0">
+      <w:startOverride w:val="1"/>
+    </w:lvlOverride>
+    <w:lvlOverride w:ilvl="1">
+      <w:startOverride w:val="1"/>
+    </w:lvlOverride>
+    <w:lvlOverride w:ilvl="2">
+      <w:startOverride w:val="1"/>
+    </w:lvlOverride>
+    <w:lvlOverride w:ilvl="3">
+      <w:startOverride w:val="1"/>
+    </w:lvlOverride>
+    <w:lvlOverride w:ilvl="4">
+      <w:startOverride w:val="1"/>
+    </w:lvlOverride>
+    <w:lvlOverride w:ilvl="5">
+      <w:startOverride w:val="1"/>
+    </w:lvlOverride>
+    <w:lvlOverride w:ilvl="6">
+      <w:startOverride w:val="1"/>
+    </w:lvlOverride>
+    <w:lvlOverride w:ilvl="7">
+      <w:startOverride w:val="1"/>
+    </w:lvlOverride>
+    <w:lvlOverride w:ilvl="8">
+      <w:startOverride w:val="1"/>
+    </w:lvlOverride>
+  </w:num>
+  <w:num w:numId="1020">
+    <w:abstractNumId w:val="99201"/>
+    <w:lvlOverride w:ilvl="0">
+      <w:startOverride w:val="1"/>
+    </w:lvlOverride>
+    <w:lvlOverride w:ilvl="1">
+      <w:startOverride w:val="1"/>
+    </w:lvlOverride>
+    <w:lvlOverride w:ilvl="2">
+      <w:startOverride w:val="1"/>
+    </w:lvlOverride>
+    <w:lvlOverride w:ilvl="3">
+      <w:startOverride w:val="1"/>
+    </w:lvlOverride>
+    <w:lvlOverride w:ilvl="4">
+      <w:startOverride w:val="1"/>
+    </w:lvlOverride>
+    <w:lvlOverride w:ilvl="5">
+      <w:startOverride w:val="1"/>
+    </w:lvlOverride>
+    <w:lvlOverride w:ilvl="6">
+      <w:startOverride w:val="1"/>
+    </w:lvlOverride>
+    <w:lvlOverride w:ilvl="7">
+      <w:startOverride w:val="1"/>
+    </w:lvlOverride>
+    <w:lvlOverride w:ilvl="8">
+      <w:startOverride w:val="1"/>
+    </w:lvlOverride>
+  </w:num>
+  <w:num w:numId="1021">
+    <w:abstractNumId w:val="99201"/>
+    <w:lvlOverride w:ilvl="0">
+      <w:startOverride w:val="1"/>
+    </w:lvlOverride>
+    <w:lvlOverride w:ilvl="1">
+      <w:startOverride w:val="1"/>
+    </w:lvlOverride>
+    <w:lvlOverride w:ilvl="2">
+      <w:startOverride w:val="1"/>
+    </w:lvlOverride>
+    <w:lvlOverride w:ilvl="3">
+      <w:startOverride w:val="1"/>
+    </w:lvlOverride>
+    <w:lvlOverride w:ilvl="4">
+      <w:startOverride w:val="1"/>
+    </w:lvlOverride>
+    <w:lvlOverride w:ilvl="5">
+      <w:startOverride w:val="1"/>
+    </w:lvlOverride>
+    <w:lvlOverride w:ilvl="6">
+      <w:startOverride w:val="1"/>
+    </w:lvlOverride>
+    <w:lvlOverride w:ilvl="7">
+      <w:startOverride w:val="1"/>
+    </w:lvlOverride>
+    <w:lvlOverride w:ilvl="8">
+      <w:startOverride w:val="1"/>
+    </w:lvlOverride>
+  </w:num>
+  <w:num w:numId="1022">
     <w:abstractNumId w:val="99201"/>
     <w:lvlOverride w:ilvl="0">
       <w:startOverride w:val="1"/>

</xml_diff>

<commit_message>
A2/A3 weights 30/30; tutorial 5 = I2C, .ioc slides moved to tutorial 6 (.ioc, SR04, self-learning last); session-table typo fixes; Word copy regenerated; CLAUDE.md rule on the Word copy; MP.md updates
Co-Authored-By: Claude Opus 5.5 <noreply@anthropic.com>
</commit_message>
<xml_diff>
--- a/MP2026_plan.docx
+++ b/MP2026_plan.docx
@@ -123,7 +123,7 @@
               <w:rPr>
                 <w:b/>
               </w:rPr>
-              <w:t xml:space="preserve">Tutorial</w:t>
+              <w:t xml:space="preserve">Tutorial (one week after the lecture)</w:t>
             </w:r>
           </w:p>
         </w:tc>
@@ -237,7 +237,13 @@
               <w:t xml:space="preserve"> </w:t>
             </w:r>
             <w:r>
-              <w:t xml:space="preserve">flash, blink LD2,</w:t>
+              <w:t xml:space="preserve">flash, breakpoints and</w:t>
+            </w:r>
+            <w:r>
+              <w:t xml:space="preserve"> </w:t>
+            </w:r>
+            <w:r>
+              <w:t xml:space="preserve">live expressions, blink LD2,</w:t>
             </w:r>
             <w:r>
               <w:t xml:space="preserve"> </w:t>
@@ -252,13 +258,7 @@
               <w:t xml:space="preserve"> </w:t>
             </w:r>
             <w:r>
-              <w:t xml:space="preserve">to PuTTY, breakpoints and</w:t>
-            </w:r>
-            <w:r>
-              <w:t xml:space="preserve"> </w:t>
-            </w:r>
-            <w:r>
-              <w:t xml:space="preserve">live expressions.</w:t>
+              <w:t xml:space="preserve">to PuTTY.</w:t>
             </w:r>
           </w:p>
         </w:tc>
@@ -574,7 +574,7 @@
               <w:jc w:val="left"/>
             </w:pPr>
             <w:r>
-              <w:t xml:space="preserve">RGB and buttons:</w:t>
+              <w:t xml:space="preserve">Edge vs. level triggering; blinking with</w:t>
             </w:r>
             <w:r>
               <w:t xml:space="preserve"> </w:t>
@@ -583,13 +583,25 @@
               <w:rPr>
                 <w:rStyle w:val="VerbatimChar"/>
               </w:rPr>
-              <w:t xml:space="preserve">set_rgb</w:t>
+              <w:t xml:space="preserve">HAL_GetTick</w:t>
             </w:r>
             <w:r>
               <w:t xml:space="preserve"> </w:t>
             </w:r>
             <w:r>
-              <w:t xml:space="preserve">helper, walking dot with masks, saturating brightness up/down, one-press-one-action.</w:t>
+              <w:t xml:space="preserve">and</w:t>
+            </w:r>
+            <w:r>
+              <w:t xml:space="preserve"> </w:t>
+            </w:r>
+            <w:r>
+              <w:rPr>
+                <w:rStyle w:val="VerbatimChar"/>
+              </w:rPr>
+              <w:t xml:space="preserve">HAL_Delay</w:t>
+            </w:r>
+            <w:r>
+              <w:t xml:space="preserve">.</w:t>
             </w:r>
           </w:p>
         </w:tc>
@@ -1898,7 +1910,7 @@
               <w:jc w:val="right"/>
             </w:pPr>
             <w:r>
-              <w:t xml:space="preserve">25%</w:t>
+              <w:t xml:space="preserve">30%</w:t>
             </w:r>
           </w:p>
         </w:tc>
@@ -1942,7 +1954,7 @@
               <w:jc w:val="right"/>
             </w:pPr>
             <w:r>
-              <w:t xml:space="preserve">35%</w:t>
+              <w:t xml:space="preserve">30%</w:t>
             </w:r>
           </w:p>
         </w:tc>

</xml_diff>